<commit_message>
Improve guide methods and technical blueprint
</commit_message>
<xml_diff>
--- a/outputs/guide_review_pack/05_methods_models_and_technical_blueprint.docx
+++ b/outputs/guide_review_pack/05_methods_models_and_technical_blueprint.docx
@@ -32,7 +32,20 @@
         <w:pStyle w:val="Heading1"/>
       </w:pPr>
       <w:r>
-        <w:t>System Idea</w:t>
+        <w:t>Purpose</w:t>
+      </w:r>
+    </w:p>
+    <w:p>
+      <w:r>
+        <w:t>This document describes the likely technical route for the PhD after data access is confirmed. It is a blueprint for guide discussion, not a final implementation commitment.</w:t>
+      </w:r>
+    </w:p>
+    <w:p>
+      <w:pPr>
+        <w:pStyle w:val="Heading1"/>
+      </w:pPr>
+      <w:r>
+        <w:t>Proposed System Idea</w:t>
       </w:r>
     </w:p>
     <w:p>
@@ -45,57 +58,1043 @@
         <w:pStyle w:val="Heading1"/>
       </w:pPr>
       <w:r>
-        <w:t>Candidate Data Pipeline</w:t>
+        <w:t>High-Level Workflow</w:t>
       </w:r>
     </w:p>
+    <w:tbl>
+      <w:tblPr>
+        <w:tblStyle w:val="TableGrid"/>
+        <w:tblW w:type="auto" w:w="0"/>
+        <w:jc w:val="center"/>
+        <w:tblLook w:firstColumn="1" w:firstRow="1" w:lastColumn="0" w:lastRow="0" w:noHBand="0" w:noVBand="1" w:val="04A0"/>
+      </w:tblPr>
+      <w:tblGrid>
+        <w:gridCol w:w="3120"/>
+        <w:gridCol w:w="3120"/>
+        <w:gridCol w:w="3120"/>
+      </w:tblGrid>
+      <w:tr>
+        <w:tc>
+          <w:tcPr>
+            <w:tcW w:type="dxa" w:w="2088"/>
+            <w:shd w:fill="F2F4F7"/>
+            <w:vAlign w:val="center"/>
+          </w:tcPr>
+          <w:p>
+            <w:pPr>
+              <w:spacing w:after="0"/>
+            </w:pPr>
+            <w:r/>
+            <w:r>
+              <w:rPr>
+                <w:rFonts w:ascii="Calibri" w:hAnsi="Calibri"/>
+                <w:b/>
+                <w:sz w:val="18"/>
+              </w:rPr>
+              <w:t>Step</w:t>
+            </w:r>
+          </w:p>
+        </w:tc>
+        <w:tc>
+          <w:tcPr>
+            <w:tcW w:type="dxa" w:w="3960"/>
+            <w:shd w:fill="F2F4F7"/>
+            <w:vAlign w:val="center"/>
+          </w:tcPr>
+          <w:p>
+            <w:pPr>
+              <w:spacing w:after="0"/>
+            </w:pPr>
+            <w:r/>
+            <w:r>
+              <w:rPr>
+                <w:rFonts w:ascii="Calibri" w:hAnsi="Calibri"/>
+                <w:b/>
+                <w:sz w:val="18"/>
+              </w:rPr>
+              <w:t>Purpose</w:t>
+            </w:r>
+          </w:p>
+        </w:tc>
+        <w:tc>
+          <w:tcPr>
+            <w:tcW w:type="dxa" w:w="3024"/>
+            <w:shd w:fill="F2F4F7"/>
+            <w:vAlign w:val="center"/>
+          </w:tcPr>
+          <w:p>
+            <w:pPr>
+              <w:spacing w:after="0"/>
+            </w:pPr>
+            <w:r/>
+            <w:r>
+              <w:rPr>
+                <w:rFonts w:ascii="Calibri" w:hAnsi="Calibri"/>
+                <w:b/>
+                <w:sz w:val="18"/>
+              </w:rPr>
+              <w:t>Main Output</w:t>
+            </w:r>
+          </w:p>
+        </w:tc>
+      </w:tr>
+      <w:tr>
+        <w:tc>
+          <w:tcPr>
+            <w:tcW w:type="dxa" w:w="2088"/>
+            <w:vAlign w:val="center"/>
+          </w:tcPr>
+          <w:p>
+            <w:pPr>
+              <w:spacing w:after="0"/>
+            </w:pPr>
+            <w:r/>
+            <w:r>
+              <w:rPr>
+                <w:rFonts w:ascii="Calibri" w:hAnsi="Calibri"/>
+                <w:b w:val="0"/>
+                <w:sz w:val="18"/>
+              </w:rPr>
+              <w:t>Data access and ethics</w:t>
+            </w:r>
+          </w:p>
+        </w:tc>
+        <w:tc>
+          <w:tcPr>
+            <w:tcW w:type="dxa" w:w="3960"/>
+            <w:vAlign w:val="center"/>
+          </w:tcPr>
+          <w:p>
+            <w:pPr>
+              <w:spacing w:after="0"/>
+            </w:pPr>
+            <w:r/>
+            <w:r>
+              <w:rPr>
+                <w:rFonts w:ascii="Calibri" w:hAnsi="Calibri"/>
+                <w:b w:val="0"/>
+                <w:sz w:val="18"/>
+              </w:rPr>
+              <w:t>Confirm clinic data, permission, anonymization and outcome availability.</w:t>
+            </w:r>
+          </w:p>
+        </w:tc>
+        <w:tc>
+          <w:tcPr>
+            <w:tcW w:type="dxa" w:w="3024"/>
+            <w:vAlign w:val="center"/>
+          </w:tcPr>
+          <w:p>
+            <w:pPr>
+              <w:spacing w:after="0"/>
+            </w:pPr>
+            <w:r/>
+            <w:r>
+              <w:rPr>
+                <w:rFonts w:ascii="Calibri" w:hAnsi="Calibri"/>
+                <w:b w:val="0"/>
+                <w:sz w:val="18"/>
+              </w:rPr>
+              <w:t>Approved data access plan.</w:t>
+            </w:r>
+          </w:p>
+        </w:tc>
+      </w:tr>
+      <w:tr>
+        <w:tc>
+          <w:tcPr>
+            <w:tcW w:type="dxa" w:w="2088"/>
+            <w:vAlign w:val="center"/>
+          </w:tcPr>
+          <w:p>
+            <w:pPr>
+              <w:spacing w:after="0"/>
+            </w:pPr>
+            <w:r/>
+            <w:r>
+              <w:rPr>
+                <w:rFonts w:ascii="Calibri" w:hAnsi="Calibri"/>
+                <w:b w:val="0"/>
+                <w:sz w:val="18"/>
+              </w:rPr>
+              <w:t>Data cleaning</w:t>
+            </w:r>
+          </w:p>
+        </w:tc>
+        <w:tc>
+          <w:tcPr>
+            <w:tcW w:type="dxa" w:w="3960"/>
+            <w:vAlign w:val="center"/>
+          </w:tcPr>
+          <w:p>
+            <w:pPr>
+              <w:spacing w:after="0"/>
+            </w:pPr>
+            <w:r/>
+            <w:r>
+              <w:rPr>
+                <w:rFonts w:ascii="Calibri" w:hAnsi="Calibri"/>
+                <w:b w:val="0"/>
+                <w:sz w:val="18"/>
+              </w:rPr>
+              <w:t>Handle missing values, duplicates, inconsistent formats and outliers.</w:t>
+            </w:r>
+          </w:p>
+        </w:tc>
+        <w:tc>
+          <w:tcPr>
+            <w:tcW w:type="dxa" w:w="3024"/>
+            <w:vAlign w:val="center"/>
+          </w:tcPr>
+          <w:p>
+            <w:pPr>
+              <w:spacing w:after="0"/>
+            </w:pPr>
+            <w:r/>
+            <w:r>
+              <w:rPr>
+                <w:rFonts w:ascii="Calibri" w:hAnsi="Calibri"/>
+                <w:b w:val="0"/>
+                <w:sz w:val="18"/>
+              </w:rPr>
+              <w:t>Clean research dataset.</w:t>
+            </w:r>
+          </w:p>
+        </w:tc>
+      </w:tr>
+      <w:tr>
+        <w:tc>
+          <w:tcPr>
+            <w:tcW w:type="dxa" w:w="2088"/>
+            <w:vAlign w:val="center"/>
+          </w:tcPr>
+          <w:p>
+            <w:pPr>
+              <w:spacing w:after="0"/>
+            </w:pPr>
+            <w:r/>
+            <w:r>
+              <w:rPr>
+                <w:rFonts w:ascii="Calibri" w:hAnsi="Calibri"/>
+                <w:b w:val="0"/>
+                <w:sz w:val="18"/>
+              </w:rPr>
+              <w:t>Variable mapping</w:t>
+            </w:r>
+          </w:p>
+        </w:tc>
+        <w:tc>
+          <w:tcPr>
+            <w:tcW w:type="dxa" w:w="3960"/>
+            <w:vAlign w:val="center"/>
+          </w:tcPr>
+          <w:p>
+            <w:pPr>
+              <w:spacing w:after="0"/>
+            </w:pPr>
+            <w:r/>
+            <w:r>
+              <w:rPr>
+                <w:rFonts w:ascii="Calibri" w:hAnsi="Calibri"/>
+                <w:b w:val="0"/>
+                <w:sz w:val="18"/>
+              </w:rPr>
+              <w:t>Map demographic, clinical, treatment, embryology and optional lifestyle variables.</w:t>
+            </w:r>
+          </w:p>
+        </w:tc>
+        <w:tc>
+          <w:tcPr>
+            <w:tcW w:type="dxa" w:w="3024"/>
+            <w:vAlign w:val="center"/>
+          </w:tcPr>
+          <w:p>
+            <w:pPr>
+              <w:spacing w:after="0"/>
+            </w:pPr>
+            <w:r/>
+            <w:r>
+              <w:rPr>
+                <w:rFonts w:ascii="Calibri" w:hAnsi="Calibri"/>
+                <w:b w:val="0"/>
+                <w:sz w:val="18"/>
+              </w:rPr>
+              <w:t>Feature dictionary and analysis dataset.</w:t>
+            </w:r>
+          </w:p>
+        </w:tc>
+      </w:tr>
+      <w:tr>
+        <w:tc>
+          <w:tcPr>
+            <w:tcW w:type="dxa" w:w="2088"/>
+            <w:vAlign w:val="center"/>
+          </w:tcPr>
+          <w:p>
+            <w:pPr>
+              <w:spacing w:after="0"/>
+            </w:pPr>
+            <w:r/>
+            <w:r>
+              <w:rPr>
+                <w:rFonts w:ascii="Calibri" w:hAnsi="Calibri"/>
+                <w:b w:val="0"/>
+                <w:sz w:val="18"/>
+              </w:rPr>
+              <w:t>Exploratory analysis</w:t>
+            </w:r>
+          </w:p>
+        </w:tc>
+        <w:tc>
+          <w:tcPr>
+            <w:tcW w:type="dxa" w:w="3960"/>
+            <w:vAlign w:val="center"/>
+          </w:tcPr>
+          <w:p>
+            <w:pPr>
+              <w:spacing w:after="0"/>
+            </w:pPr>
+            <w:r/>
+            <w:r>
+              <w:rPr>
+                <w:rFonts w:ascii="Calibri" w:hAnsi="Calibri"/>
+                <w:b w:val="0"/>
+                <w:sz w:val="18"/>
+              </w:rPr>
+              <w:t>Understand distributions, outcome rates, missingness and class imbalance.</w:t>
+            </w:r>
+          </w:p>
+        </w:tc>
+        <w:tc>
+          <w:tcPr>
+            <w:tcW w:type="dxa" w:w="3024"/>
+            <w:vAlign w:val="center"/>
+          </w:tcPr>
+          <w:p>
+            <w:pPr>
+              <w:spacing w:after="0"/>
+            </w:pPr>
+            <w:r/>
+            <w:r>
+              <w:rPr>
+                <w:rFonts w:ascii="Calibri" w:hAnsi="Calibri"/>
+                <w:b w:val="0"/>
+                <w:sz w:val="18"/>
+              </w:rPr>
+              <w:t>EDA summary and modelling decisions.</w:t>
+            </w:r>
+          </w:p>
+        </w:tc>
+      </w:tr>
+      <w:tr>
+        <w:tc>
+          <w:tcPr>
+            <w:tcW w:type="dxa" w:w="2088"/>
+            <w:vAlign w:val="center"/>
+          </w:tcPr>
+          <w:p>
+            <w:pPr>
+              <w:spacing w:after="0"/>
+            </w:pPr>
+            <w:r/>
+            <w:r>
+              <w:rPr>
+                <w:rFonts w:ascii="Calibri" w:hAnsi="Calibri"/>
+                <w:b w:val="0"/>
+                <w:sz w:val="18"/>
+              </w:rPr>
+              <w:t>Model development</w:t>
+            </w:r>
+          </w:p>
+        </w:tc>
+        <w:tc>
+          <w:tcPr>
+            <w:tcW w:type="dxa" w:w="3960"/>
+            <w:vAlign w:val="center"/>
+          </w:tcPr>
+          <w:p>
+            <w:pPr>
+              <w:spacing w:after="0"/>
+            </w:pPr>
+            <w:r/>
+            <w:r>
+              <w:rPr>
+                <w:rFonts w:ascii="Calibri" w:hAnsi="Calibri"/>
+                <w:b w:val="0"/>
+                <w:sz w:val="18"/>
+              </w:rPr>
+              <w:t>Compare baseline and advanced models.</w:t>
+            </w:r>
+          </w:p>
+        </w:tc>
+        <w:tc>
+          <w:tcPr>
+            <w:tcW w:type="dxa" w:w="3024"/>
+            <w:vAlign w:val="center"/>
+          </w:tcPr>
+          <w:p>
+            <w:pPr>
+              <w:spacing w:after="0"/>
+            </w:pPr>
+            <w:r/>
+            <w:r>
+              <w:rPr>
+                <w:rFonts w:ascii="Calibri" w:hAnsi="Calibri"/>
+                <w:b w:val="0"/>
+                <w:sz w:val="18"/>
+              </w:rPr>
+              <w:t>Candidate prediction models.</w:t>
+            </w:r>
+          </w:p>
+        </w:tc>
+      </w:tr>
+      <w:tr>
+        <w:tc>
+          <w:tcPr>
+            <w:tcW w:type="dxa" w:w="2088"/>
+            <w:vAlign w:val="center"/>
+          </w:tcPr>
+          <w:p>
+            <w:pPr>
+              <w:spacing w:after="0"/>
+            </w:pPr>
+            <w:r/>
+            <w:r>
+              <w:rPr>
+                <w:rFonts w:ascii="Calibri" w:hAnsi="Calibri"/>
+                <w:b w:val="0"/>
+                <w:sz w:val="18"/>
+              </w:rPr>
+              <w:t>Explainability</w:t>
+            </w:r>
+          </w:p>
+        </w:tc>
+        <w:tc>
+          <w:tcPr>
+            <w:tcW w:type="dxa" w:w="3960"/>
+            <w:vAlign w:val="center"/>
+          </w:tcPr>
+          <w:p>
+            <w:pPr>
+              <w:spacing w:after="0"/>
+            </w:pPr>
+            <w:r/>
+            <w:r>
+              <w:rPr>
+                <w:rFonts w:ascii="Calibri" w:hAnsi="Calibri"/>
+                <w:b w:val="0"/>
+                <w:sz w:val="18"/>
+              </w:rPr>
+              <w:t>Explain global patterns and patient-level predictions.</w:t>
+            </w:r>
+          </w:p>
+        </w:tc>
+        <w:tc>
+          <w:tcPr>
+            <w:tcW w:type="dxa" w:w="3024"/>
+            <w:vAlign w:val="center"/>
+          </w:tcPr>
+          <w:p>
+            <w:pPr>
+              <w:spacing w:after="0"/>
+            </w:pPr>
+            <w:r/>
+            <w:r>
+              <w:rPr>
+                <w:rFonts w:ascii="Calibri" w:hAnsi="Calibri"/>
+                <w:b w:val="0"/>
+                <w:sz w:val="18"/>
+              </w:rPr>
+              <w:t>XAI outputs for clinician review.</w:t>
+            </w:r>
+          </w:p>
+        </w:tc>
+      </w:tr>
+      <w:tr>
+        <w:tc>
+          <w:tcPr>
+            <w:tcW w:type="dxa" w:w="2088"/>
+            <w:vAlign w:val="center"/>
+          </w:tcPr>
+          <w:p>
+            <w:pPr>
+              <w:spacing w:after="0"/>
+            </w:pPr>
+            <w:r/>
+            <w:r>
+              <w:rPr>
+                <w:rFonts w:ascii="Calibri" w:hAnsi="Calibri"/>
+                <w:b w:val="0"/>
+                <w:sz w:val="18"/>
+              </w:rPr>
+              <w:t>Validation</w:t>
+            </w:r>
+          </w:p>
+        </w:tc>
+        <w:tc>
+          <w:tcPr>
+            <w:tcW w:type="dxa" w:w="3960"/>
+            <w:vAlign w:val="center"/>
+          </w:tcPr>
+          <w:p>
+            <w:pPr>
+              <w:spacing w:after="0"/>
+            </w:pPr>
+            <w:r/>
+            <w:r>
+              <w:rPr>
+                <w:rFonts w:ascii="Calibri" w:hAnsi="Calibri"/>
+                <w:b w:val="0"/>
+                <w:sz w:val="18"/>
+              </w:rPr>
+              <w:t>Test internal, temporal, subgroup or external performance depending on data.</w:t>
+            </w:r>
+          </w:p>
+        </w:tc>
+        <w:tc>
+          <w:tcPr>
+            <w:tcW w:type="dxa" w:w="3024"/>
+            <w:vAlign w:val="center"/>
+          </w:tcPr>
+          <w:p>
+            <w:pPr>
+              <w:spacing w:after="0"/>
+            </w:pPr>
+            <w:r/>
+            <w:r>
+              <w:rPr>
+                <w:rFonts w:ascii="Calibri" w:hAnsi="Calibri"/>
+                <w:b w:val="0"/>
+                <w:sz w:val="18"/>
+              </w:rPr>
+              <w:t>Validation report.</w:t>
+            </w:r>
+          </w:p>
+        </w:tc>
+      </w:tr>
+      <w:tr>
+        <w:tc>
+          <w:tcPr>
+            <w:tcW w:type="dxa" w:w="2088"/>
+            <w:vAlign w:val="center"/>
+          </w:tcPr>
+          <w:p>
+            <w:pPr>
+              <w:spacing w:after="0"/>
+            </w:pPr>
+            <w:r/>
+            <w:r>
+              <w:rPr>
+                <w:rFonts w:ascii="Calibri" w:hAnsi="Calibri"/>
+                <w:b w:val="0"/>
+                <w:sz w:val="18"/>
+              </w:rPr>
+              <w:t>CDSS prototype</w:t>
+            </w:r>
+          </w:p>
+        </w:tc>
+        <w:tc>
+          <w:tcPr>
+            <w:tcW w:type="dxa" w:w="3960"/>
+            <w:vAlign w:val="center"/>
+          </w:tcPr>
+          <w:p>
+            <w:pPr>
+              <w:spacing w:after="0"/>
+            </w:pPr>
+            <w:r/>
+            <w:r>
+              <w:rPr>
+                <w:rFonts w:ascii="Calibri" w:hAnsi="Calibri"/>
+                <w:b w:val="0"/>
+                <w:sz w:val="18"/>
+              </w:rPr>
+              <w:t>Convert model and explanation into a doctor-facing output.</w:t>
+            </w:r>
+          </w:p>
+        </w:tc>
+        <w:tc>
+          <w:tcPr>
+            <w:tcW w:type="dxa" w:w="3024"/>
+            <w:vAlign w:val="center"/>
+          </w:tcPr>
+          <w:p>
+            <w:pPr>
+              <w:spacing w:after="0"/>
+            </w:pPr>
+            <w:r/>
+            <w:r>
+              <w:rPr>
+                <w:rFonts w:ascii="Calibri" w:hAnsi="Calibri"/>
+                <w:b w:val="0"/>
+                <w:sz w:val="18"/>
+              </w:rPr>
+              <w:t>Prototype or mock decision-support screen.</w:t>
+            </w:r>
+          </w:p>
+        </w:tc>
+      </w:tr>
+    </w:tbl>
+    <w:p/>
     <w:p>
       <w:pPr>
-        <w:pStyle w:val="ListNumber"/>
+        <w:pStyle w:val="Heading1"/>
       </w:pPr>
       <w:r>
-        <w:t>Collect anonymized IVF records after permission and ethics approval.</w:t>
+        <w:t>Data Model</w:t>
       </w:r>
     </w:p>
-    <w:p>
-      <w:pPr>
-        <w:pStyle w:val="ListNumber"/>
-      </w:pPr>
-      <w:r>
-        <w:t>Clean missing values, inconsistent formats and outliers.</w:t>
-      </w:r>
-    </w:p>
-    <w:p>
-      <w:pPr>
-        <w:pStyle w:val="ListNumber"/>
-      </w:pPr>
-      <w:r>
-        <w:t>Map clinical, treatment-cycle, embryology and optional lifestyle variables.</w:t>
-      </w:r>
-    </w:p>
-    <w:p>
-      <w:pPr>
-        <w:pStyle w:val="ListNumber"/>
-      </w:pPr>
-      <w:r>
-        <w:t>Train baseline and advanced machine-learning models.</w:t>
-      </w:r>
-    </w:p>
-    <w:p>
-      <w:pPr>
-        <w:pStyle w:val="ListNumber"/>
-      </w:pPr>
-      <w:r>
-        <w:t>Evaluate discrimination, calibration and subgroup performance.</w:t>
-      </w:r>
-    </w:p>
-    <w:p>
-      <w:pPr>
-        <w:pStyle w:val="ListNumber"/>
-      </w:pPr>
-      <w:r>
-        <w:t>Generate XAI explanations and test whether clinicians find them useful.</w:t>
-      </w:r>
-    </w:p>
+    <w:tbl>
+      <w:tblPr>
+        <w:tblStyle w:val="TableGrid"/>
+        <w:tblW w:type="auto" w:w="0"/>
+        <w:jc w:val="center"/>
+        <w:tblLook w:firstColumn="1" w:firstRow="1" w:lastColumn="0" w:lastRow="0" w:noHBand="0" w:noVBand="1" w:val="04A0"/>
+      </w:tblPr>
+      <w:tblGrid>
+        <w:gridCol w:w="3120"/>
+        <w:gridCol w:w="3120"/>
+        <w:gridCol w:w="3120"/>
+      </w:tblGrid>
+      <w:tr>
+        <w:tc>
+          <w:tcPr>
+            <w:tcW w:type="dxa" w:w="2088"/>
+            <w:shd w:fill="F2F4F7"/>
+            <w:vAlign w:val="center"/>
+          </w:tcPr>
+          <w:p>
+            <w:pPr>
+              <w:spacing w:after="0"/>
+            </w:pPr>
+            <w:r/>
+            <w:r>
+              <w:rPr>
+                <w:rFonts w:ascii="Calibri" w:hAnsi="Calibri"/>
+                <w:b/>
+                <w:sz w:val="18"/>
+              </w:rPr>
+              <w:t>Table / Entity</w:t>
+            </w:r>
+          </w:p>
+        </w:tc>
+        <w:tc>
+          <w:tcPr>
+            <w:tcW w:type="dxa" w:w="4320"/>
+            <w:shd w:fill="F2F4F7"/>
+            <w:vAlign w:val="center"/>
+          </w:tcPr>
+          <w:p>
+            <w:pPr>
+              <w:spacing w:after="0"/>
+            </w:pPr>
+            <w:r/>
+            <w:r>
+              <w:rPr>
+                <w:rFonts w:ascii="Calibri" w:hAnsi="Calibri"/>
+                <w:b/>
+                <w:sz w:val="18"/>
+              </w:rPr>
+              <w:t>Example Fields</w:t>
+            </w:r>
+          </w:p>
+        </w:tc>
+        <w:tc>
+          <w:tcPr>
+            <w:tcW w:type="dxa" w:w="2664"/>
+            <w:shd w:fill="F2F4F7"/>
+            <w:vAlign w:val="center"/>
+          </w:tcPr>
+          <w:p>
+            <w:pPr>
+              <w:spacing w:after="0"/>
+            </w:pPr>
+            <w:r/>
+            <w:r>
+              <w:rPr>
+                <w:rFonts w:ascii="Calibri" w:hAnsi="Calibri"/>
+                <w:b/>
+                <w:sz w:val="18"/>
+              </w:rPr>
+              <w:t>Use</w:t>
+            </w:r>
+          </w:p>
+        </w:tc>
+      </w:tr>
+      <w:tr>
+        <w:tc>
+          <w:tcPr>
+            <w:tcW w:type="dxa" w:w="2088"/>
+            <w:vAlign w:val="center"/>
+          </w:tcPr>
+          <w:p>
+            <w:pPr>
+              <w:spacing w:after="0"/>
+            </w:pPr>
+            <w:r/>
+            <w:r>
+              <w:rPr>
+                <w:rFonts w:ascii="Calibri" w:hAnsi="Calibri"/>
+                <w:b w:val="0"/>
+                <w:sz w:val="18"/>
+              </w:rPr>
+              <w:t>Patient</w:t>
+            </w:r>
+          </w:p>
+        </w:tc>
+        <w:tc>
+          <w:tcPr>
+            <w:tcW w:type="dxa" w:w="4320"/>
+            <w:vAlign w:val="center"/>
+          </w:tcPr>
+          <w:p>
+            <w:pPr>
+              <w:spacing w:after="0"/>
+            </w:pPr>
+            <w:r/>
+            <w:r>
+              <w:rPr>
+                <w:rFonts w:ascii="Calibri" w:hAnsi="Calibri"/>
+                <w:b w:val="0"/>
+                <w:sz w:val="18"/>
+              </w:rPr>
+              <w:t>anonymous patient ID, age, BMI, infertility duration, diagnosis.</w:t>
+            </w:r>
+          </w:p>
+        </w:tc>
+        <w:tc>
+          <w:tcPr>
+            <w:tcW w:type="dxa" w:w="2664"/>
+            <w:vAlign w:val="center"/>
+          </w:tcPr>
+          <w:p>
+            <w:pPr>
+              <w:spacing w:after="0"/>
+            </w:pPr>
+            <w:r/>
+            <w:r>
+              <w:rPr>
+                <w:rFonts w:ascii="Calibri" w:hAnsi="Calibri"/>
+                <w:b w:val="0"/>
+                <w:sz w:val="18"/>
+              </w:rPr>
+              <w:t>Patient-level risk and counselling context.</w:t>
+            </w:r>
+          </w:p>
+        </w:tc>
+      </w:tr>
+      <w:tr>
+        <w:tc>
+          <w:tcPr>
+            <w:tcW w:type="dxa" w:w="2088"/>
+            <w:vAlign w:val="center"/>
+          </w:tcPr>
+          <w:p>
+            <w:pPr>
+              <w:spacing w:after="0"/>
+            </w:pPr>
+            <w:r/>
+            <w:r>
+              <w:rPr>
+                <w:rFonts w:ascii="Calibri" w:hAnsi="Calibri"/>
+                <w:b w:val="0"/>
+                <w:sz w:val="18"/>
+              </w:rPr>
+              <w:t>Cycle</w:t>
+            </w:r>
+          </w:p>
+        </w:tc>
+        <w:tc>
+          <w:tcPr>
+            <w:tcW w:type="dxa" w:w="4320"/>
+            <w:vAlign w:val="center"/>
+          </w:tcPr>
+          <w:p>
+            <w:pPr>
+              <w:spacing w:after="0"/>
+            </w:pPr>
+            <w:r/>
+            <w:r>
+              <w:rPr>
+                <w:rFonts w:ascii="Calibri" w:hAnsi="Calibri"/>
+                <w:b w:val="0"/>
+                <w:sz w:val="18"/>
+              </w:rPr>
+              <w:t>cycle ID, year, IVF/ICSI, fresh/frozen, protocol, trigger, endometrial thickness.</w:t>
+            </w:r>
+          </w:p>
+        </w:tc>
+        <w:tc>
+          <w:tcPr>
+            <w:tcW w:type="dxa" w:w="2664"/>
+            <w:vAlign w:val="center"/>
+          </w:tcPr>
+          <w:p>
+            <w:pPr>
+              <w:spacing w:after="0"/>
+            </w:pPr>
+            <w:r/>
+            <w:r>
+              <w:rPr>
+                <w:rFonts w:ascii="Calibri" w:hAnsi="Calibri"/>
+                <w:b w:val="0"/>
+                <w:sz w:val="18"/>
+              </w:rPr>
+              <w:t>Treatment-cycle modelling and temporal validation.</w:t>
+            </w:r>
+          </w:p>
+        </w:tc>
+      </w:tr>
+      <w:tr>
+        <w:tc>
+          <w:tcPr>
+            <w:tcW w:type="dxa" w:w="2088"/>
+            <w:vAlign w:val="center"/>
+          </w:tcPr>
+          <w:p>
+            <w:pPr>
+              <w:spacing w:after="0"/>
+            </w:pPr>
+            <w:r/>
+            <w:r>
+              <w:rPr>
+                <w:rFonts w:ascii="Calibri" w:hAnsi="Calibri"/>
+                <w:b w:val="0"/>
+                <w:sz w:val="18"/>
+              </w:rPr>
+              <w:t>Hormone / ovarian reserve</w:t>
+            </w:r>
+          </w:p>
+        </w:tc>
+        <w:tc>
+          <w:tcPr>
+            <w:tcW w:type="dxa" w:w="4320"/>
+            <w:vAlign w:val="center"/>
+          </w:tcPr>
+          <w:p>
+            <w:pPr>
+              <w:spacing w:after="0"/>
+            </w:pPr>
+            <w:r/>
+            <w:r>
+              <w:rPr>
+                <w:rFonts w:ascii="Calibri" w:hAnsi="Calibri"/>
+                <w:b w:val="0"/>
+                <w:sz w:val="18"/>
+              </w:rPr>
+              <w:t>AMH, AFC, FSH, LH, estradiol, progesterone.</w:t>
+            </w:r>
+          </w:p>
+        </w:tc>
+        <w:tc>
+          <w:tcPr>
+            <w:tcW w:type="dxa" w:w="2664"/>
+            <w:vAlign w:val="center"/>
+          </w:tcPr>
+          <w:p>
+            <w:pPr>
+              <w:spacing w:after="0"/>
+            </w:pPr>
+            <w:r/>
+            <w:r>
+              <w:rPr>
+                <w:rFonts w:ascii="Calibri" w:hAnsi="Calibri"/>
+                <w:b w:val="0"/>
+                <w:sz w:val="18"/>
+              </w:rPr>
+              <w:t>Clinical prediction and ovarian response explanation.</w:t>
+            </w:r>
+          </w:p>
+        </w:tc>
+      </w:tr>
+      <w:tr>
+        <w:tc>
+          <w:tcPr>
+            <w:tcW w:type="dxa" w:w="2088"/>
+            <w:vAlign w:val="center"/>
+          </w:tcPr>
+          <w:p>
+            <w:pPr>
+              <w:spacing w:after="0"/>
+            </w:pPr>
+            <w:r/>
+            <w:r>
+              <w:rPr>
+                <w:rFonts w:ascii="Calibri" w:hAnsi="Calibri"/>
+                <w:b w:val="0"/>
+                <w:sz w:val="18"/>
+              </w:rPr>
+              <w:t>Embryology</w:t>
+            </w:r>
+          </w:p>
+        </w:tc>
+        <w:tc>
+          <w:tcPr>
+            <w:tcW w:type="dxa" w:w="4320"/>
+            <w:vAlign w:val="center"/>
+          </w:tcPr>
+          <w:p>
+            <w:pPr>
+              <w:spacing w:after="0"/>
+            </w:pPr>
+            <w:r/>
+            <w:r>
+              <w:rPr>
+                <w:rFonts w:ascii="Calibri" w:hAnsi="Calibri"/>
+                <w:b w:val="0"/>
+                <w:sz w:val="18"/>
+              </w:rPr>
+              <w:t>oocytes, MII oocytes, fertilization, embryo grade, blastocyst grade, embryos transferred.</w:t>
+            </w:r>
+          </w:p>
+        </w:tc>
+        <w:tc>
+          <w:tcPr>
+            <w:tcW w:type="dxa" w:w="2664"/>
+            <w:vAlign w:val="center"/>
+          </w:tcPr>
+          <w:p>
+            <w:pPr>
+              <w:spacing w:after="0"/>
+            </w:pPr>
+            <w:r/>
+            <w:r>
+              <w:rPr>
+                <w:rFonts w:ascii="Calibri" w:hAnsi="Calibri"/>
+                <w:b w:val="0"/>
+                <w:sz w:val="18"/>
+              </w:rPr>
+              <w:t>Multimodal prediction if available.</w:t>
+            </w:r>
+          </w:p>
+        </w:tc>
+      </w:tr>
+      <w:tr>
+        <w:tc>
+          <w:tcPr>
+            <w:tcW w:type="dxa" w:w="2088"/>
+            <w:vAlign w:val="center"/>
+          </w:tcPr>
+          <w:p>
+            <w:pPr>
+              <w:spacing w:after="0"/>
+            </w:pPr>
+            <w:r/>
+            <w:r>
+              <w:rPr>
+                <w:rFonts w:ascii="Calibri" w:hAnsi="Calibri"/>
+                <w:b w:val="0"/>
+                <w:sz w:val="18"/>
+              </w:rPr>
+              <w:t>Outcome</w:t>
+            </w:r>
+          </w:p>
+        </w:tc>
+        <w:tc>
+          <w:tcPr>
+            <w:tcW w:type="dxa" w:w="4320"/>
+            <w:vAlign w:val="center"/>
+          </w:tcPr>
+          <w:p>
+            <w:pPr>
+              <w:spacing w:after="0"/>
+            </w:pPr>
+            <w:r/>
+            <w:r>
+              <w:rPr>
+                <w:rFonts w:ascii="Calibri" w:hAnsi="Calibri"/>
+                <w:b w:val="0"/>
+                <w:sz w:val="18"/>
+              </w:rPr>
+              <w:t>clinical pregnancy, live birth, miscarriage, implantation, oocyte yield.</w:t>
+            </w:r>
+          </w:p>
+        </w:tc>
+        <w:tc>
+          <w:tcPr>
+            <w:tcW w:type="dxa" w:w="2664"/>
+            <w:vAlign w:val="center"/>
+          </w:tcPr>
+          <w:p>
+            <w:pPr>
+              <w:spacing w:after="0"/>
+            </w:pPr>
+            <w:r/>
+            <w:r>
+              <w:rPr>
+                <w:rFonts w:ascii="Calibri" w:hAnsi="Calibri"/>
+                <w:b w:val="0"/>
+                <w:sz w:val="18"/>
+              </w:rPr>
+              <w:t>Dependent variable definition.</w:t>
+            </w:r>
+          </w:p>
+        </w:tc>
+      </w:tr>
+      <w:tr>
+        <w:tc>
+          <w:tcPr>
+            <w:tcW w:type="dxa" w:w="2088"/>
+            <w:vAlign w:val="center"/>
+          </w:tcPr>
+          <w:p>
+            <w:pPr>
+              <w:spacing w:after="0"/>
+            </w:pPr>
+            <w:r/>
+            <w:r>
+              <w:rPr>
+                <w:rFonts w:ascii="Calibri" w:hAnsi="Calibri"/>
+                <w:b w:val="0"/>
+                <w:sz w:val="18"/>
+              </w:rPr>
+              <w:t>Lifestyle</w:t>
+            </w:r>
+          </w:p>
+        </w:tc>
+        <w:tc>
+          <w:tcPr>
+            <w:tcW w:type="dxa" w:w="4320"/>
+            <w:vAlign w:val="center"/>
+          </w:tcPr>
+          <w:p>
+            <w:pPr>
+              <w:spacing w:after="0"/>
+            </w:pPr>
+            <w:r/>
+            <w:r>
+              <w:rPr>
+                <w:rFonts w:ascii="Calibri" w:hAnsi="Calibri"/>
+                <w:b w:val="0"/>
+                <w:sz w:val="18"/>
+              </w:rPr>
+              <w:t>smoking, sleep, stress, activity, diet.</w:t>
+            </w:r>
+          </w:p>
+        </w:tc>
+        <w:tc>
+          <w:tcPr>
+            <w:tcW w:type="dxa" w:w="2664"/>
+            <w:vAlign w:val="center"/>
+          </w:tcPr>
+          <w:p>
+            <w:pPr>
+              <w:spacing w:after="0"/>
+            </w:pPr>
+            <w:r/>
+            <w:r>
+              <w:rPr>
+                <w:rFonts w:ascii="Calibri" w:hAnsi="Calibri"/>
+                <w:b w:val="0"/>
+                <w:sz w:val="18"/>
+              </w:rPr>
+              <w:t>Optional personalization only if reliably collected.</w:t>
+            </w:r>
+          </w:p>
+        </w:tc>
+      </w:tr>
+    </w:tbl>
+    <w:p/>
     <w:p>
       <w:pPr>
         <w:pStyle w:val="Heading1"/>
@@ -112,13 +1111,14 @@
         <w:tblLook w:firstColumn="1" w:firstRow="1" w:lastColumn="0" w:lastRow="0" w:noHBand="0" w:noVBand="1" w:val="04A0"/>
       </w:tblPr>
       <w:tblGrid>
-        <w:gridCol w:w="4680"/>
-        <w:gridCol w:w="4680"/>
+        <w:gridCol w:w="3120"/>
+        <w:gridCol w:w="3120"/>
+        <w:gridCol w:w="3120"/>
       </w:tblGrid>
       <w:tr>
         <w:tc>
           <w:tcPr>
-            <w:tcW w:type="dxa" w:w="3024"/>
+            <w:tcW w:type="dxa" w:w="2088"/>
             <w:shd w:fill="F2F4F7"/>
             <w:vAlign w:val="center"/>
           </w:tcPr>
@@ -139,7 +1139,7 @@
         </w:tc>
         <w:tc>
           <w:tcPr>
-            <w:tcW w:type="dxa" w:w="6048"/>
+            <w:tcW w:type="dxa" w:w="3240"/>
             <w:shd w:fill="F2F4F7"/>
             <w:vAlign w:val="center"/>
           </w:tcPr>
@@ -158,11 +1158,32 @@
             </w:r>
           </w:p>
         </w:tc>
+        <w:tc>
+          <w:tcPr>
+            <w:tcW w:type="dxa" w:w="3816"/>
+            <w:shd w:fill="F2F4F7"/>
+            <w:vAlign w:val="center"/>
+          </w:tcPr>
+          <w:p>
+            <w:pPr>
+              <w:spacing w:after="0"/>
+            </w:pPr>
+            <w:r/>
+            <w:r>
+              <w:rPr>
+                <w:rFonts w:ascii="Calibri" w:hAnsi="Calibri"/>
+                <w:b/>
+                <w:sz w:val="18"/>
+              </w:rPr>
+              <w:t>When To Use</w:t>
+            </w:r>
+          </w:p>
+        </w:tc>
       </w:tr>
       <w:tr>
         <w:tc>
           <w:tcPr>
-            <w:tcW w:type="dxa" w:w="3024"/>
+            <w:tcW w:type="dxa" w:w="2088"/>
             <w:vAlign w:val="center"/>
           </w:tcPr>
           <w:p>
@@ -182,7 +1203,7 @@
         </w:tc>
         <w:tc>
           <w:tcPr>
-            <w:tcW w:type="dxa" w:w="6048"/>
+            <w:tcW w:type="dxa" w:w="3240"/>
             <w:vAlign w:val="center"/>
           </w:tcPr>
           <w:p>
@@ -200,11 +1221,31 @@
             </w:r>
           </w:p>
         </w:tc>
+        <w:tc>
+          <w:tcPr>
+            <w:tcW w:type="dxa" w:w="3816"/>
+            <w:vAlign w:val="center"/>
+          </w:tcPr>
+          <w:p>
+            <w:pPr>
+              <w:spacing w:after="0"/>
+            </w:pPr>
+            <w:r/>
+            <w:r>
+              <w:rPr>
+                <w:rFonts w:ascii="Calibri" w:hAnsi="Calibri"/>
+                <w:b w:val="0"/>
+                <w:sz w:val="18"/>
+              </w:rPr>
+              <w:t>Always useful as a transparent starting point.</w:t>
+            </w:r>
+          </w:p>
+        </w:tc>
       </w:tr>
       <w:tr>
         <w:tc>
           <w:tcPr>
-            <w:tcW w:type="dxa" w:w="3024"/>
+            <w:tcW w:type="dxa" w:w="2088"/>
             <w:vAlign w:val="center"/>
           </w:tcPr>
           <w:p>
@@ -224,7 +1265,7 @@
         </w:tc>
         <w:tc>
           <w:tcPr>
-            <w:tcW w:type="dxa" w:w="6048"/>
+            <w:tcW w:type="dxa" w:w="3240"/>
             <w:vAlign w:val="center"/>
           </w:tcPr>
           <w:p>
@@ -238,7 +1279,27 @@
                 <w:b w:val="0"/>
                 <w:sz w:val="18"/>
               </w:rPr>
-              <w:t>Simple interpretable model.</w:t>
+              <w:t>Simple rule-like model.</w:t>
+            </w:r>
+          </w:p>
+        </w:tc>
+        <w:tc>
+          <w:tcPr>
+            <w:tcW w:type="dxa" w:w="3816"/>
+            <w:vAlign w:val="center"/>
+          </w:tcPr>
+          <w:p>
+            <w:pPr>
+              <w:spacing w:after="0"/>
+            </w:pPr>
+            <w:r/>
+            <w:r>
+              <w:rPr>
+                <w:rFonts w:ascii="Calibri" w:hAnsi="Calibri"/>
+                <w:b w:val="0"/>
+                <w:sz w:val="18"/>
+              </w:rPr>
+              <w:t>Useful for explanation but may overfit.</w:t>
             </w:r>
           </w:p>
         </w:tc>
@@ -246,7 +1307,7 @@
       <w:tr>
         <w:tc>
           <w:tcPr>
-            <w:tcW w:type="dxa" w:w="3024"/>
+            <w:tcW w:type="dxa" w:w="2088"/>
             <w:vAlign w:val="center"/>
           </w:tcPr>
           <w:p>
@@ -266,7 +1327,7 @@
         </w:tc>
         <w:tc>
           <w:tcPr>
-            <w:tcW w:type="dxa" w:w="6048"/>
+            <w:tcW w:type="dxa" w:w="3240"/>
             <w:vAlign w:val="center"/>
           </w:tcPr>
           <w:p>
@@ -284,11 +1345,31 @@
             </w:r>
           </w:p>
         </w:tc>
+        <w:tc>
+          <w:tcPr>
+            <w:tcW w:type="dxa" w:w="3816"/>
+            <w:vAlign w:val="center"/>
+          </w:tcPr>
+          <w:p>
+            <w:pPr>
+              <w:spacing w:after="0"/>
+            </w:pPr>
+            <w:r/>
+            <w:r>
+              <w:rPr>
+                <w:rFonts w:ascii="Calibri" w:hAnsi="Calibri"/>
+                <w:b w:val="0"/>
+                <w:sz w:val="18"/>
+              </w:rPr>
+              <w:t>Useful when relationships are not purely linear.</w:t>
+            </w:r>
+          </w:p>
+        </w:tc>
       </w:tr>
       <w:tr>
         <w:tc>
           <w:tcPr>
-            <w:tcW w:type="dxa" w:w="3024"/>
+            <w:tcW w:type="dxa" w:w="2088"/>
             <w:vAlign w:val="center"/>
           </w:tcPr>
           <w:p>
@@ -308,7 +1389,7 @@
         </w:tc>
         <w:tc>
           <w:tcPr>
-            <w:tcW w:type="dxa" w:w="6048"/>
+            <w:tcW w:type="dxa" w:w="3240"/>
             <w:vAlign w:val="center"/>
           </w:tcPr>
           <w:p>
@@ -326,11 +1407,31 @@
             </w:r>
           </w:p>
         </w:tc>
+        <w:tc>
+          <w:tcPr>
+            <w:tcW w:type="dxa" w:w="3816"/>
+            <w:vAlign w:val="center"/>
+          </w:tcPr>
+          <w:p>
+            <w:pPr>
+              <w:spacing w:after="0"/>
+            </w:pPr>
+            <w:r/>
+            <w:r>
+              <w:rPr>
+                <w:rFonts w:ascii="Calibri" w:hAnsi="Calibri"/>
+                <w:b w:val="0"/>
+                <w:sz w:val="18"/>
+              </w:rPr>
+              <w:t>Likely primary advanced models for tabular clinical/embryology data.</w:t>
+            </w:r>
+          </w:p>
+        </w:tc>
       </w:tr>
       <w:tr>
         <w:tc>
           <w:tcPr>
-            <w:tcW w:type="dxa" w:w="3024"/>
+            <w:tcW w:type="dxa" w:w="2088"/>
             <w:vAlign w:val="center"/>
           </w:tcPr>
           <w:p>
@@ -350,7 +1451,7 @@
         </w:tc>
         <w:tc>
           <w:tcPr>
-            <w:tcW w:type="dxa" w:w="6048"/>
+            <w:tcW w:type="dxa" w:w="3240"/>
             <w:vAlign w:val="center"/>
           </w:tcPr>
           <w:p>
@@ -364,7 +1465,27 @@
                 <w:b w:val="0"/>
                 <w:sz w:val="18"/>
               </w:rPr>
-              <w:t>Comparison model if dataset size and feature set support it.</w:t>
+              <w:t>Comparison model.</w:t>
+            </w:r>
+          </w:p>
+        </w:tc>
+        <w:tc>
+          <w:tcPr>
+            <w:tcW w:type="dxa" w:w="3816"/>
+            <w:vAlign w:val="center"/>
+          </w:tcPr>
+          <w:p>
+            <w:pPr>
+              <w:spacing w:after="0"/>
+            </w:pPr>
+            <w:r/>
+            <w:r>
+              <w:rPr>
+                <w:rFonts w:ascii="Calibri" w:hAnsi="Calibri"/>
+                <w:b w:val="0"/>
+                <w:sz w:val="18"/>
+              </w:rPr>
+              <w:t>Use only if dataset size and feature scaling support it.</w:t>
             </w:r>
           </w:p>
         </w:tc>
@@ -372,7 +1493,7 @@
       <w:tr>
         <w:tc>
           <w:tcPr>
-            <w:tcW w:type="dxa" w:w="3024"/>
+            <w:tcW w:type="dxa" w:w="2088"/>
             <w:vAlign w:val="center"/>
           </w:tcPr>
           <w:p>
@@ -392,7 +1513,7 @@
         </w:tc>
         <w:tc>
           <w:tcPr>
-            <w:tcW w:type="dxa" w:w="6048"/>
+            <w:tcW w:type="dxa" w:w="3240"/>
             <w:vAlign w:val="center"/>
           </w:tcPr>
           <w:p>
@@ -406,7 +1527,27 @@
                 <w:b w:val="0"/>
                 <w:sz w:val="18"/>
               </w:rPr>
-              <w:t>Only if data volume or image/time-lapse data justifies it.</w:t>
+              <w:t>Deep learning candidate.</w:t>
+            </w:r>
+          </w:p>
+        </w:tc>
+        <w:tc>
+          <w:tcPr>
+            <w:tcW w:type="dxa" w:w="3816"/>
+            <w:vAlign w:val="center"/>
+          </w:tcPr>
+          <w:p>
+            <w:pPr>
+              <w:spacing w:after="0"/>
+            </w:pPr>
+            <w:r/>
+            <w:r>
+              <w:rPr>
+                <w:rFonts w:ascii="Calibri" w:hAnsi="Calibri"/>
+                <w:b w:val="0"/>
+                <w:sz w:val="18"/>
+              </w:rPr>
+              <w:t>Use only for large data, image/time-lapse data or clear technical justification.</w:t>
             </w:r>
           </w:p>
         </w:tc>
@@ -418,39 +1559,449 @@
         <w:pStyle w:val="Heading1"/>
       </w:pPr>
       <w:r>
-        <w:t>Explainability Methods</w:t>
+        <w:t>Recommended Model Strategy</w:t>
       </w:r>
     </w:p>
     <w:p>
       <w:pPr>
-        <w:pStyle w:val="ListBullet"/>
+        <w:pStyle w:val="ListNumber"/>
       </w:pPr>
       <w:r>
-        <w:t>SHAP for global and patient-level explanations.</w:t>
+        <w:t>Start with Logistic Regression as the baseline.</w:t>
       </w:r>
     </w:p>
     <w:p>
       <w:pPr>
-        <w:pStyle w:val="ListBullet"/>
+        <w:pStyle w:val="ListNumber"/>
       </w:pPr>
       <w:r>
-        <w:t>LIME as a possible local explanation comparison.</w:t>
+        <w:t>Add Random Forest as a non-linear comparison model.</w:t>
       </w:r>
     </w:p>
     <w:p>
       <w:pPr>
-        <w:pStyle w:val="ListBullet"/>
+        <w:pStyle w:val="ListNumber"/>
       </w:pPr>
       <w:r>
-        <w:t>Permutation importance for model-agnostic feature importance.</w:t>
+        <w:t>Use XGBoost or LightGBM as the main advanced tabular-data model.</w:t>
       </w:r>
     </w:p>
     <w:p>
       <w:pPr>
-        <w:pStyle w:val="ListBullet"/>
+        <w:pStyle w:val="ListNumber"/>
       </w:pPr>
       <w:r>
-        <w:t>Partial dependence or related plots for selected variables if clinically meaningful.</w:t>
+        <w:t>Use deep learning only if image, time-lapse or sufficiently large data are available.</w:t>
+      </w:r>
+    </w:p>
+    <w:p>
+      <w:pPr>
+        <w:pStyle w:val="ListNumber"/>
+      </w:pPr>
+      <w:r>
+        <w:t>Select the final model using performance, calibration, explainability and clinical usefulness, not accuracy alone.</w:t>
+      </w:r>
+    </w:p>
+    <w:p>
+      <w:pPr>
+        <w:pStyle w:val="Heading1"/>
+      </w:pPr>
+      <w:r>
+        <w:t>Explainability Methods</w:t>
+      </w:r>
+    </w:p>
+    <w:tbl>
+      <w:tblPr>
+        <w:tblStyle w:val="TableGrid"/>
+        <w:tblW w:type="auto" w:w="0"/>
+        <w:jc w:val="center"/>
+        <w:tblLook w:firstColumn="1" w:firstRow="1" w:lastColumn="0" w:lastRow="0" w:noHBand="0" w:noVBand="1" w:val="04A0"/>
+      </w:tblPr>
+      <w:tblGrid>
+        <w:gridCol w:w="3120"/>
+        <w:gridCol w:w="3120"/>
+        <w:gridCol w:w="3120"/>
+      </w:tblGrid>
+      <w:tr>
+        <w:tc>
+          <w:tcPr>
+            <w:tcW w:type="dxa" w:w="1944"/>
+            <w:shd w:fill="F2F4F7"/>
+            <w:vAlign w:val="center"/>
+          </w:tcPr>
+          <w:p>
+            <w:pPr>
+              <w:spacing w:after="0"/>
+            </w:pPr>
+            <w:r/>
+            <w:r>
+              <w:rPr>
+                <w:rFonts w:ascii="Calibri" w:hAnsi="Calibri"/>
+                <w:b/>
+                <w:sz w:val="18"/>
+              </w:rPr>
+              <w:t>Method</w:t>
+            </w:r>
+          </w:p>
+        </w:tc>
+        <w:tc>
+          <w:tcPr>
+            <w:tcW w:type="dxa" w:w="3816"/>
+            <w:shd w:fill="F2F4F7"/>
+            <w:vAlign w:val="center"/>
+          </w:tcPr>
+          <w:p>
+            <w:pPr>
+              <w:spacing w:after="0"/>
+            </w:pPr>
+            <w:r/>
+            <w:r>
+              <w:rPr>
+                <w:rFonts w:ascii="Calibri" w:hAnsi="Calibri"/>
+                <w:b/>
+                <w:sz w:val="18"/>
+              </w:rPr>
+              <w:t>Use</w:t>
+            </w:r>
+          </w:p>
+        </w:tc>
+        <w:tc>
+          <w:tcPr>
+            <w:tcW w:type="dxa" w:w="3312"/>
+            <w:shd w:fill="F2F4F7"/>
+            <w:vAlign w:val="center"/>
+          </w:tcPr>
+          <w:p>
+            <w:pPr>
+              <w:spacing w:after="0"/>
+            </w:pPr>
+            <w:r/>
+            <w:r>
+              <w:rPr>
+                <w:rFonts w:ascii="Calibri" w:hAnsi="Calibri"/>
+                <w:b/>
+                <w:sz w:val="18"/>
+              </w:rPr>
+              <w:t>Caution</w:t>
+            </w:r>
+          </w:p>
+        </w:tc>
+      </w:tr>
+      <w:tr>
+        <w:tc>
+          <w:tcPr>
+            <w:tcW w:type="dxa" w:w="1944"/>
+            <w:vAlign w:val="center"/>
+          </w:tcPr>
+          <w:p>
+            <w:pPr>
+              <w:spacing w:after="0"/>
+            </w:pPr>
+            <w:r/>
+            <w:r>
+              <w:rPr>
+                <w:rFonts w:ascii="Calibri" w:hAnsi="Calibri"/>
+                <w:b w:val="0"/>
+                <w:sz w:val="18"/>
+              </w:rPr>
+              <w:t>SHAP</w:t>
+            </w:r>
+          </w:p>
+        </w:tc>
+        <w:tc>
+          <w:tcPr>
+            <w:tcW w:type="dxa" w:w="3816"/>
+            <w:vAlign w:val="center"/>
+          </w:tcPr>
+          <w:p>
+            <w:pPr>
+              <w:spacing w:after="0"/>
+            </w:pPr>
+            <w:r/>
+            <w:r>
+              <w:rPr>
+                <w:rFonts w:ascii="Calibri" w:hAnsi="Calibri"/>
+                <w:b w:val="0"/>
+                <w:sz w:val="18"/>
+              </w:rPr>
+              <w:t>Global feature importance and patient-level positive/negative drivers.</w:t>
+            </w:r>
+          </w:p>
+        </w:tc>
+        <w:tc>
+          <w:tcPr>
+            <w:tcW w:type="dxa" w:w="3312"/>
+            <w:vAlign w:val="center"/>
+          </w:tcPr>
+          <w:p>
+            <w:pPr>
+              <w:spacing w:after="0"/>
+            </w:pPr>
+            <w:r/>
+            <w:r>
+              <w:rPr>
+                <w:rFonts w:ascii="Calibri" w:hAnsi="Calibri"/>
+                <w:b w:val="0"/>
+                <w:sz w:val="18"/>
+              </w:rPr>
+              <w:t>Explanations must be interpreted clinically, not as causality.</w:t>
+            </w:r>
+          </w:p>
+        </w:tc>
+      </w:tr>
+      <w:tr>
+        <w:tc>
+          <w:tcPr>
+            <w:tcW w:type="dxa" w:w="1944"/>
+            <w:vAlign w:val="center"/>
+          </w:tcPr>
+          <w:p>
+            <w:pPr>
+              <w:spacing w:after="0"/>
+            </w:pPr>
+            <w:r/>
+            <w:r>
+              <w:rPr>
+                <w:rFonts w:ascii="Calibri" w:hAnsi="Calibri"/>
+                <w:b w:val="0"/>
+                <w:sz w:val="18"/>
+              </w:rPr>
+              <w:t>LIME</w:t>
+            </w:r>
+          </w:p>
+        </w:tc>
+        <w:tc>
+          <w:tcPr>
+            <w:tcW w:type="dxa" w:w="3816"/>
+            <w:vAlign w:val="center"/>
+          </w:tcPr>
+          <w:p>
+            <w:pPr>
+              <w:spacing w:after="0"/>
+            </w:pPr>
+            <w:r/>
+            <w:r>
+              <w:rPr>
+                <w:rFonts w:ascii="Calibri" w:hAnsi="Calibri"/>
+                <w:b w:val="0"/>
+                <w:sz w:val="18"/>
+              </w:rPr>
+              <w:t>Optional local explanation comparison.</w:t>
+            </w:r>
+          </w:p>
+        </w:tc>
+        <w:tc>
+          <w:tcPr>
+            <w:tcW w:type="dxa" w:w="3312"/>
+            <w:vAlign w:val="center"/>
+          </w:tcPr>
+          <w:p>
+            <w:pPr>
+              <w:spacing w:after="0"/>
+            </w:pPr>
+            <w:r/>
+            <w:r>
+              <w:rPr>
+                <w:rFonts w:ascii="Calibri" w:hAnsi="Calibri"/>
+                <w:b w:val="0"/>
+                <w:sz w:val="18"/>
+              </w:rPr>
+              <w:t>Can be unstable; use as supporting method only.</w:t>
+            </w:r>
+          </w:p>
+        </w:tc>
+      </w:tr>
+      <w:tr>
+        <w:tc>
+          <w:tcPr>
+            <w:tcW w:type="dxa" w:w="1944"/>
+            <w:vAlign w:val="center"/>
+          </w:tcPr>
+          <w:p>
+            <w:pPr>
+              <w:spacing w:after="0"/>
+            </w:pPr>
+            <w:r/>
+            <w:r>
+              <w:rPr>
+                <w:rFonts w:ascii="Calibri" w:hAnsi="Calibri"/>
+                <w:b w:val="0"/>
+                <w:sz w:val="18"/>
+              </w:rPr>
+              <w:t>Permutation importance</w:t>
+            </w:r>
+          </w:p>
+        </w:tc>
+        <w:tc>
+          <w:tcPr>
+            <w:tcW w:type="dxa" w:w="3816"/>
+            <w:vAlign w:val="center"/>
+          </w:tcPr>
+          <w:p>
+            <w:pPr>
+              <w:spacing w:after="0"/>
+            </w:pPr>
+            <w:r/>
+            <w:r>
+              <w:rPr>
+                <w:rFonts w:ascii="Calibri" w:hAnsi="Calibri"/>
+                <w:b w:val="0"/>
+                <w:sz w:val="18"/>
+              </w:rPr>
+              <w:t>Model-agnostic feature importance.</w:t>
+            </w:r>
+          </w:p>
+        </w:tc>
+        <w:tc>
+          <w:tcPr>
+            <w:tcW w:type="dxa" w:w="3312"/>
+            <w:vAlign w:val="center"/>
+          </w:tcPr>
+          <w:p>
+            <w:pPr>
+              <w:spacing w:after="0"/>
+            </w:pPr>
+            <w:r/>
+            <w:r>
+              <w:rPr>
+                <w:rFonts w:ascii="Calibri" w:hAnsi="Calibri"/>
+                <w:b w:val="0"/>
+                <w:sz w:val="18"/>
+              </w:rPr>
+              <w:t>Can be affected by correlated predictors.</w:t>
+            </w:r>
+          </w:p>
+        </w:tc>
+      </w:tr>
+      <w:tr>
+        <w:tc>
+          <w:tcPr>
+            <w:tcW w:type="dxa" w:w="1944"/>
+            <w:vAlign w:val="center"/>
+          </w:tcPr>
+          <w:p>
+            <w:pPr>
+              <w:spacing w:after="0"/>
+            </w:pPr>
+            <w:r/>
+            <w:r>
+              <w:rPr>
+                <w:rFonts w:ascii="Calibri" w:hAnsi="Calibri"/>
+                <w:b w:val="0"/>
+                <w:sz w:val="18"/>
+              </w:rPr>
+              <w:t>Partial dependence / related plots</w:t>
+            </w:r>
+          </w:p>
+        </w:tc>
+        <w:tc>
+          <w:tcPr>
+            <w:tcW w:type="dxa" w:w="3816"/>
+            <w:vAlign w:val="center"/>
+          </w:tcPr>
+          <w:p>
+            <w:pPr>
+              <w:spacing w:after="0"/>
+            </w:pPr>
+            <w:r/>
+            <w:r>
+              <w:rPr>
+                <w:rFonts w:ascii="Calibri" w:hAnsi="Calibri"/>
+                <w:b w:val="0"/>
+                <w:sz w:val="18"/>
+              </w:rPr>
+              <w:t>Shows model relationship for selected variables.</w:t>
+            </w:r>
+          </w:p>
+        </w:tc>
+        <w:tc>
+          <w:tcPr>
+            <w:tcW w:type="dxa" w:w="3312"/>
+            <w:vAlign w:val="center"/>
+          </w:tcPr>
+          <w:p>
+            <w:pPr>
+              <w:spacing w:after="0"/>
+            </w:pPr>
+            <w:r/>
+            <w:r>
+              <w:rPr>
+                <w:rFonts w:ascii="Calibri" w:hAnsi="Calibri"/>
+                <w:b w:val="0"/>
+                <w:sz w:val="18"/>
+              </w:rPr>
+              <w:t>Use only for clinically meaningful variables.</w:t>
+            </w:r>
+          </w:p>
+        </w:tc>
+      </w:tr>
+      <w:tr>
+        <w:tc>
+          <w:tcPr>
+            <w:tcW w:type="dxa" w:w="1944"/>
+            <w:vAlign w:val="center"/>
+          </w:tcPr>
+          <w:p>
+            <w:pPr>
+              <w:spacing w:after="0"/>
+            </w:pPr>
+            <w:r/>
+            <w:r>
+              <w:rPr>
+                <w:rFonts w:ascii="Calibri" w:hAnsi="Calibri"/>
+                <w:b w:val="0"/>
+                <w:sz w:val="18"/>
+              </w:rPr>
+              <w:t>Explanation card</w:t>
+            </w:r>
+          </w:p>
+        </w:tc>
+        <w:tc>
+          <w:tcPr>
+            <w:tcW w:type="dxa" w:w="3816"/>
+            <w:vAlign w:val="center"/>
+          </w:tcPr>
+          <w:p>
+            <w:pPr>
+              <w:spacing w:after="0"/>
+            </w:pPr>
+            <w:r/>
+            <w:r>
+              <w:rPr>
+                <w:rFonts w:ascii="Calibri" w:hAnsi="Calibri"/>
+                <w:b w:val="0"/>
+                <w:sz w:val="18"/>
+              </w:rPr>
+              <w:t>Doctor-facing summary of probability, key factors and caution notes.</w:t>
+            </w:r>
+          </w:p>
+        </w:tc>
+        <w:tc>
+          <w:tcPr>
+            <w:tcW w:type="dxa" w:w="3312"/>
+            <w:vAlign w:val="center"/>
+          </w:tcPr>
+          <w:p>
+            <w:pPr>
+              <w:spacing w:after="0"/>
+            </w:pPr>
+            <w:r/>
+            <w:r>
+              <w:rPr>
+                <w:rFonts w:ascii="Calibri" w:hAnsi="Calibri"/>
+                <w:b w:val="0"/>
+                <w:sz w:val="18"/>
+              </w:rPr>
+              <w:t>Must be reviewed by clinicians before claiming usefulness.</w:t>
+            </w:r>
+          </w:p>
+        </w:tc>
+      </w:tr>
+    </w:tbl>
+    <w:p/>
+    <w:p>
+      <w:r>
+        <w:br w:type="page"/>
       </w:r>
     </w:p>
     <w:p>
@@ -469,13 +2020,14 @@
         <w:tblLook w:firstColumn="1" w:firstRow="1" w:lastColumn="0" w:lastRow="0" w:noHBand="0" w:noVBand="1" w:val="04A0"/>
       </w:tblPr>
       <w:tblGrid>
-        <w:gridCol w:w="4680"/>
-        <w:gridCol w:w="4680"/>
+        <w:gridCol w:w="3120"/>
+        <w:gridCol w:w="3120"/>
+        <w:gridCol w:w="3120"/>
       </w:tblGrid>
       <w:tr>
         <w:tc>
           <w:tcPr>
-            <w:tcW w:type="dxa" w:w="2448"/>
+            <w:tcW w:type="dxa" w:w="2088"/>
             <w:shd w:fill="F2F4F7"/>
             <w:vAlign w:val="center"/>
           </w:tcPr>
@@ -496,7 +2048,7 @@
         </w:tc>
         <w:tc>
           <w:tcPr>
-            <w:tcW w:type="dxa" w:w="6624"/>
+            <w:tcW w:type="dxa" w:w="3384"/>
             <w:shd w:fill="F2F4F7"/>
             <w:vAlign w:val="center"/>
           </w:tcPr>
@@ -515,11 +2067,32 @@
             </w:r>
           </w:p>
         </w:tc>
+        <w:tc>
+          <w:tcPr>
+            <w:tcW w:type="dxa" w:w="3600"/>
+            <w:shd w:fill="F2F4F7"/>
+            <w:vAlign w:val="center"/>
+          </w:tcPr>
+          <w:p>
+            <w:pPr>
+              <w:spacing w:after="0"/>
+            </w:pPr>
+            <w:r/>
+            <w:r>
+              <w:rPr>
+                <w:rFonts w:ascii="Calibri" w:hAnsi="Calibri"/>
+                <w:b/>
+                <w:sz w:val="18"/>
+              </w:rPr>
+              <w:t>Why It Matters</w:t>
+            </w:r>
+          </w:p>
+        </w:tc>
       </w:tr>
       <w:tr>
         <w:tc>
           <w:tcPr>
-            <w:tcW w:type="dxa" w:w="2448"/>
+            <w:tcW w:type="dxa" w:w="2088"/>
             <w:vAlign w:val="center"/>
           </w:tcPr>
           <w:p>
@@ -533,13 +2106,13 @@
                 <w:b w:val="0"/>
                 <w:sz w:val="18"/>
               </w:rPr>
-              <w:t>Classification</w:t>
+              <w:t>Discrimination</w:t>
             </w:r>
           </w:p>
         </w:tc>
         <w:tc>
           <w:tcPr>
-            <w:tcW w:type="dxa" w:w="6624"/>
+            <w:tcW w:type="dxa" w:w="3384"/>
             <w:vAlign w:val="center"/>
           </w:tcPr>
           <w:p>
@@ -553,7 +2126,27 @@
                 <w:b w:val="0"/>
                 <w:sz w:val="18"/>
               </w:rPr>
-              <w:t>AUC, accuracy, sensitivity, specificity, precision, recall, F1.</w:t>
+              <w:t>AUC, sensitivity, specificity, precision, recall, F1.</w:t>
+            </w:r>
+          </w:p>
+        </w:tc>
+        <w:tc>
+          <w:tcPr>
+            <w:tcW w:type="dxa" w:w="3600"/>
+            <w:vAlign w:val="center"/>
+          </w:tcPr>
+          <w:p>
+            <w:pPr>
+              <w:spacing w:after="0"/>
+            </w:pPr>
+            <w:r/>
+            <w:r>
+              <w:rPr>
+                <w:rFonts w:ascii="Calibri" w:hAnsi="Calibri"/>
+                <w:b w:val="0"/>
+                <w:sz w:val="18"/>
+              </w:rPr>
+              <w:t>Shows whether model separates outcome groups.</w:t>
             </w:r>
           </w:p>
         </w:tc>
@@ -561,7 +2154,7 @@
       <w:tr>
         <w:tc>
           <w:tcPr>
-            <w:tcW w:type="dxa" w:w="2448"/>
+            <w:tcW w:type="dxa" w:w="2088"/>
             <w:vAlign w:val="center"/>
           </w:tcPr>
           <w:p>
@@ -581,7 +2174,7 @@
         </w:tc>
         <w:tc>
           <w:tcPr>
-            <w:tcW w:type="dxa" w:w="6624"/>
+            <w:tcW w:type="dxa" w:w="3384"/>
             <w:vAlign w:val="center"/>
           </w:tcPr>
           <w:p>
@@ -599,11 +2192,31 @@
             </w:r>
           </w:p>
         </w:tc>
+        <w:tc>
+          <w:tcPr>
+            <w:tcW w:type="dxa" w:w="3600"/>
+            <w:vAlign w:val="center"/>
+          </w:tcPr>
+          <w:p>
+            <w:pPr>
+              <w:spacing w:after="0"/>
+            </w:pPr>
+            <w:r/>
+            <w:r>
+              <w:rPr>
+                <w:rFonts w:ascii="Calibri" w:hAnsi="Calibri"/>
+                <w:b w:val="0"/>
+                <w:sz w:val="18"/>
+              </w:rPr>
+              <w:t>Important because clinicians need reliable probabilities.</w:t>
+            </w:r>
+          </w:p>
+        </w:tc>
       </w:tr>
       <w:tr>
         <w:tc>
           <w:tcPr>
-            <w:tcW w:type="dxa" w:w="2448"/>
+            <w:tcW w:type="dxa" w:w="2088"/>
             <w:vAlign w:val="center"/>
           </w:tcPr>
           <w:p>
@@ -623,7 +2236,7 @@
         </w:tc>
         <w:tc>
           <w:tcPr>
-            <w:tcW w:type="dxa" w:w="6624"/>
+            <w:tcW w:type="dxa" w:w="3384"/>
             <w:vAlign w:val="center"/>
           </w:tcPr>
           <w:p>
@@ -641,11 +2254,31 @@
             </w:r>
           </w:p>
         </w:tc>
+        <w:tc>
+          <w:tcPr>
+            <w:tcW w:type="dxa" w:w="3600"/>
+            <w:vAlign w:val="center"/>
+          </w:tcPr>
+          <w:p>
+            <w:pPr>
+              <w:spacing w:after="0"/>
+            </w:pPr>
+            <w:r/>
+            <w:r>
+              <w:rPr>
+                <w:rFonts w:ascii="Calibri" w:hAnsi="Calibri"/>
+                <w:b w:val="0"/>
+                <w:sz w:val="18"/>
+              </w:rPr>
+              <w:t>Shows whether predictions may support decisions better than simple strategies.</w:t>
+            </w:r>
+          </w:p>
+        </w:tc>
       </w:tr>
       <w:tr>
         <w:tc>
           <w:tcPr>
-            <w:tcW w:type="dxa" w:w="2448"/>
+            <w:tcW w:type="dxa" w:w="2088"/>
             <w:vAlign w:val="center"/>
           </w:tcPr>
           <w:p>
@@ -665,7 +2298,7 @@
         </w:tc>
         <w:tc>
           <w:tcPr>
-            <w:tcW w:type="dxa" w:w="6624"/>
+            <w:tcW w:type="dxa" w:w="3384"/>
             <w:vAlign w:val="center"/>
           </w:tcPr>
           <w:p>
@@ -679,7 +2312,27 @@
                 <w:b w:val="0"/>
                 <w:sz w:val="18"/>
               </w:rPr>
-              <w:t>External, temporal or subgroup validation depending on data.</w:t>
+              <w:t>Internal, temporal, subgroup or external validation.</w:t>
+            </w:r>
+          </w:p>
+        </w:tc>
+        <w:tc>
+          <w:tcPr>
+            <w:tcW w:type="dxa" w:w="3600"/>
+            <w:vAlign w:val="center"/>
+          </w:tcPr>
+          <w:p>
+            <w:pPr>
+              <w:spacing w:after="0"/>
+            </w:pPr>
+            <w:r/>
+            <w:r>
+              <w:rPr>
+                <w:rFonts w:ascii="Calibri" w:hAnsi="Calibri"/>
+                <w:b w:val="0"/>
+                <w:sz w:val="18"/>
+              </w:rPr>
+              <w:t>Addresses repeated literature gap around poor validation.</w:t>
             </w:r>
           </w:p>
         </w:tc>
@@ -687,7 +2340,7 @@
       <w:tr>
         <w:tc>
           <w:tcPr>
-            <w:tcW w:type="dxa" w:w="2448"/>
+            <w:tcW w:type="dxa" w:w="2088"/>
             <w:vAlign w:val="center"/>
           </w:tcPr>
           <w:p>
@@ -707,7 +2360,7 @@
         </w:tc>
         <w:tc>
           <w:tcPr>
-            <w:tcW w:type="dxa" w:w="6624"/>
+            <w:tcW w:type="dxa" w:w="3384"/>
             <w:vAlign w:val="center"/>
           </w:tcPr>
           <w:p>
@@ -721,7 +2374,1601 @@
                 <w:b w:val="0"/>
                 <w:sz w:val="18"/>
               </w:rPr>
-              <w:t>Clinician review or structured feedback.</w:t>
+              <w:t>SHAP review, clinician feedback or structured questionnaire.</w:t>
+            </w:r>
+          </w:p>
+        </w:tc>
+        <w:tc>
+          <w:tcPr>
+            <w:tcW w:type="dxa" w:w="3600"/>
+            <w:vAlign w:val="center"/>
+          </w:tcPr>
+          <w:p>
+            <w:pPr>
+              <w:spacing w:after="0"/>
+            </w:pPr>
+            <w:r/>
+            <w:r>
+              <w:rPr>
+                <w:rFonts w:ascii="Calibri" w:hAnsi="Calibri"/>
+                <w:b w:val="0"/>
+                <w:sz w:val="18"/>
+              </w:rPr>
+              <w:t>Tests whether explanations are understandable and useful.</w:t>
+            </w:r>
+          </w:p>
+        </w:tc>
+      </w:tr>
+    </w:tbl>
+    <w:p/>
+    <w:p>
+      <w:pPr>
+        <w:pStyle w:val="Heading1"/>
+      </w:pPr>
+      <w:r>
+        <w:t>Possible Technology Stack</w:t>
+      </w:r>
+    </w:p>
+    <w:tbl>
+      <w:tblPr>
+        <w:tblStyle w:val="TableGrid"/>
+        <w:tblW w:type="auto" w:w="0"/>
+        <w:jc w:val="center"/>
+        <w:tblLook w:firstColumn="1" w:firstRow="1" w:lastColumn="0" w:lastRow="0" w:noHBand="0" w:noVBand="1" w:val="04A0"/>
+      </w:tblPr>
+      <w:tblGrid>
+        <w:gridCol w:w="3120"/>
+        <w:gridCol w:w="3120"/>
+        <w:gridCol w:w="3120"/>
+      </w:tblGrid>
+      <w:tr>
+        <w:tc>
+          <w:tcPr>
+            <w:tcW w:type="dxa" w:w="2088"/>
+            <w:shd w:fill="F2F4F7"/>
+            <w:vAlign w:val="center"/>
+          </w:tcPr>
+          <w:p>
+            <w:pPr>
+              <w:spacing w:after="0"/>
+            </w:pPr>
+            <w:r/>
+            <w:r>
+              <w:rPr>
+                <w:rFonts w:ascii="Calibri" w:hAnsi="Calibri"/>
+                <w:b/>
+                <w:sz w:val="18"/>
+              </w:rPr>
+              <w:t>Area</w:t>
+            </w:r>
+          </w:p>
+        </w:tc>
+        <w:tc>
+          <w:tcPr>
+            <w:tcW w:type="dxa" w:w="3312"/>
+            <w:shd w:fill="F2F4F7"/>
+            <w:vAlign w:val="center"/>
+          </w:tcPr>
+          <w:p>
+            <w:pPr>
+              <w:spacing w:after="0"/>
+            </w:pPr>
+            <w:r/>
+            <w:r>
+              <w:rPr>
+                <w:rFonts w:ascii="Calibri" w:hAnsi="Calibri"/>
+                <w:b/>
+                <w:sz w:val="18"/>
+              </w:rPr>
+              <w:t>Candidate Tools</w:t>
+            </w:r>
+          </w:p>
+        </w:tc>
+        <w:tc>
+          <w:tcPr>
+            <w:tcW w:type="dxa" w:w="3672"/>
+            <w:shd w:fill="F2F4F7"/>
+            <w:vAlign w:val="center"/>
+          </w:tcPr>
+          <w:p>
+            <w:pPr>
+              <w:spacing w:after="0"/>
+            </w:pPr>
+            <w:r/>
+            <w:r>
+              <w:rPr>
+                <w:rFonts w:ascii="Calibri" w:hAnsi="Calibri"/>
+                <w:b/>
+                <w:sz w:val="18"/>
+              </w:rPr>
+              <w:t>Comment</w:t>
+            </w:r>
+          </w:p>
+        </w:tc>
+      </w:tr>
+      <w:tr>
+        <w:tc>
+          <w:tcPr>
+            <w:tcW w:type="dxa" w:w="2088"/>
+            <w:vAlign w:val="center"/>
+          </w:tcPr>
+          <w:p>
+            <w:pPr>
+              <w:spacing w:after="0"/>
+            </w:pPr>
+            <w:r/>
+            <w:r>
+              <w:rPr>
+                <w:rFonts w:ascii="Calibri" w:hAnsi="Calibri"/>
+                <w:b w:val="0"/>
+                <w:sz w:val="18"/>
+              </w:rPr>
+              <w:t>Data processing</w:t>
+            </w:r>
+          </w:p>
+        </w:tc>
+        <w:tc>
+          <w:tcPr>
+            <w:tcW w:type="dxa" w:w="3312"/>
+            <w:vAlign w:val="center"/>
+          </w:tcPr>
+          <w:p>
+            <w:pPr>
+              <w:spacing w:after="0"/>
+            </w:pPr>
+            <w:r/>
+            <w:r>
+              <w:rPr>
+                <w:rFonts w:ascii="Calibri" w:hAnsi="Calibri"/>
+                <w:b w:val="0"/>
+                <w:sz w:val="18"/>
+              </w:rPr>
+              <w:t>Python, Pandas, NumPy.</w:t>
+            </w:r>
+          </w:p>
+        </w:tc>
+        <w:tc>
+          <w:tcPr>
+            <w:tcW w:type="dxa" w:w="3672"/>
+            <w:vAlign w:val="center"/>
+          </w:tcPr>
+          <w:p>
+            <w:pPr>
+              <w:spacing w:after="0"/>
+            </w:pPr>
+            <w:r/>
+            <w:r>
+              <w:rPr>
+                <w:rFonts w:ascii="Calibri" w:hAnsi="Calibri"/>
+                <w:b w:val="0"/>
+                <w:sz w:val="18"/>
+              </w:rPr>
+              <w:t>Suitable for structured IVF data cleaning.</w:t>
+            </w:r>
+          </w:p>
+        </w:tc>
+      </w:tr>
+      <w:tr>
+        <w:tc>
+          <w:tcPr>
+            <w:tcW w:type="dxa" w:w="2088"/>
+            <w:vAlign w:val="center"/>
+          </w:tcPr>
+          <w:p>
+            <w:pPr>
+              <w:spacing w:after="0"/>
+            </w:pPr>
+            <w:r/>
+            <w:r>
+              <w:rPr>
+                <w:rFonts w:ascii="Calibri" w:hAnsi="Calibri"/>
+                <w:b w:val="0"/>
+                <w:sz w:val="18"/>
+              </w:rPr>
+              <w:t>Machine learning</w:t>
+            </w:r>
+          </w:p>
+        </w:tc>
+        <w:tc>
+          <w:tcPr>
+            <w:tcW w:type="dxa" w:w="3312"/>
+            <w:vAlign w:val="center"/>
+          </w:tcPr>
+          <w:p>
+            <w:pPr>
+              <w:spacing w:after="0"/>
+            </w:pPr>
+            <w:r/>
+            <w:r>
+              <w:rPr>
+                <w:rFonts w:ascii="Calibri" w:hAnsi="Calibri"/>
+                <w:b w:val="0"/>
+                <w:sz w:val="18"/>
+              </w:rPr>
+              <w:t>Scikit-learn, XGBoost, LightGBM.</w:t>
+            </w:r>
+          </w:p>
+        </w:tc>
+        <w:tc>
+          <w:tcPr>
+            <w:tcW w:type="dxa" w:w="3672"/>
+            <w:vAlign w:val="center"/>
+          </w:tcPr>
+          <w:p>
+            <w:pPr>
+              <w:spacing w:after="0"/>
+            </w:pPr>
+            <w:r/>
+            <w:r>
+              <w:rPr>
+                <w:rFonts w:ascii="Calibri" w:hAnsi="Calibri"/>
+                <w:b w:val="0"/>
+                <w:sz w:val="18"/>
+              </w:rPr>
+              <w:t>Practical and widely used for tabular clinical data.</w:t>
+            </w:r>
+          </w:p>
+        </w:tc>
+      </w:tr>
+      <w:tr>
+        <w:tc>
+          <w:tcPr>
+            <w:tcW w:type="dxa" w:w="2088"/>
+            <w:vAlign w:val="center"/>
+          </w:tcPr>
+          <w:p>
+            <w:pPr>
+              <w:spacing w:after="0"/>
+            </w:pPr>
+            <w:r/>
+            <w:r>
+              <w:rPr>
+                <w:rFonts w:ascii="Calibri" w:hAnsi="Calibri"/>
+                <w:b w:val="0"/>
+                <w:sz w:val="18"/>
+              </w:rPr>
+              <w:t>Explainable AI</w:t>
+            </w:r>
+          </w:p>
+        </w:tc>
+        <w:tc>
+          <w:tcPr>
+            <w:tcW w:type="dxa" w:w="3312"/>
+            <w:vAlign w:val="center"/>
+          </w:tcPr>
+          <w:p>
+            <w:pPr>
+              <w:spacing w:after="0"/>
+            </w:pPr>
+            <w:r/>
+            <w:r>
+              <w:rPr>
+                <w:rFonts w:ascii="Calibri" w:hAnsi="Calibri"/>
+                <w:b w:val="0"/>
+                <w:sz w:val="18"/>
+              </w:rPr>
+              <w:t>SHAP, LIME, permutation importance.</w:t>
+            </w:r>
+          </w:p>
+        </w:tc>
+        <w:tc>
+          <w:tcPr>
+            <w:tcW w:type="dxa" w:w="3672"/>
+            <w:vAlign w:val="center"/>
+          </w:tcPr>
+          <w:p>
+            <w:pPr>
+              <w:spacing w:after="0"/>
+            </w:pPr>
+            <w:r/>
+            <w:r>
+              <w:rPr>
+                <w:rFonts w:ascii="Calibri" w:hAnsi="Calibri"/>
+                <w:b w:val="0"/>
+                <w:sz w:val="18"/>
+              </w:rPr>
+              <w:t>Use with careful clinical interpretation.</w:t>
+            </w:r>
+          </w:p>
+        </w:tc>
+      </w:tr>
+      <w:tr>
+        <w:tc>
+          <w:tcPr>
+            <w:tcW w:type="dxa" w:w="2088"/>
+            <w:vAlign w:val="center"/>
+          </w:tcPr>
+          <w:p>
+            <w:pPr>
+              <w:spacing w:after="0"/>
+            </w:pPr>
+            <w:r/>
+            <w:r>
+              <w:rPr>
+                <w:rFonts w:ascii="Calibri" w:hAnsi="Calibri"/>
+                <w:b w:val="0"/>
+                <w:sz w:val="18"/>
+              </w:rPr>
+              <w:t>Visualization</w:t>
+            </w:r>
+          </w:p>
+        </w:tc>
+        <w:tc>
+          <w:tcPr>
+            <w:tcW w:type="dxa" w:w="3312"/>
+            <w:vAlign w:val="center"/>
+          </w:tcPr>
+          <w:p>
+            <w:pPr>
+              <w:spacing w:after="0"/>
+            </w:pPr>
+            <w:r/>
+            <w:r>
+              <w:rPr>
+                <w:rFonts w:ascii="Calibri" w:hAnsi="Calibri"/>
+                <w:b w:val="0"/>
+                <w:sz w:val="18"/>
+              </w:rPr>
+              <w:t>Matplotlib, Seaborn, Plotly.</w:t>
+            </w:r>
+          </w:p>
+        </w:tc>
+        <w:tc>
+          <w:tcPr>
+            <w:tcW w:type="dxa" w:w="3672"/>
+            <w:vAlign w:val="center"/>
+          </w:tcPr>
+          <w:p>
+            <w:pPr>
+              <w:spacing w:after="0"/>
+            </w:pPr>
+            <w:r/>
+            <w:r>
+              <w:rPr>
+                <w:rFonts w:ascii="Calibri" w:hAnsi="Calibri"/>
+                <w:b w:val="0"/>
+                <w:sz w:val="18"/>
+              </w:rPr>
+              <w:t>Useful for EDA, model results and guide/panel presentation.</w:t>
+            </w:r>
+          </w:p>
+        </w:tc>
+      </w:tr>
+      <w:tr>
+        <w:tc>
+          <w:tcPr>
+            <w:tcW w:type="dxa" w:w="2088"/>
+            <w:vAlign w:val="center"/>
+          </w:tcPr>
+          <w:p>
+            <w:pPr>
+              <w:spacing w:after="0"/>
+            </w:pPr>
+            <w:r/>
+            <w:r>
+              <w:rPr>
+                <w:rFonts w:ascii="Calibri" w:hAnsi="Calibri"/>
+                <w:b w:val="0"/>
+                <w:sz w:val="18"/>
+              </w:rPr>
+              <w:t>Prototype</w:t>
+            </w:r>
+          </w:p>
+        </w:tc>
+        <w:tc>
+          <w:tcPr>
+            <w:tcW w:type="dxa" w:w="3312"/>
+            <w:vAlign w:val="center"/>
+          </w:tcPr>
+          <w:p>
+            <w:pPr>
+              <w:spacing w:after="0"/>
+            </w:pPr>
+            <w:r/>
+            <w:r>
+              <w:rPr>
+                <w:rFonts w:ascii="Calibri" w:hAnsi="Calibri"/>
+                <w:b w:val="0"/>
+                <w:sz w:val="18"/>
+              </w:rPr>
+              <w:t>Streamlit, Flask or FastAPI.</w:t>
+            </w:r>
+          </w:p>
+        </w:tc>
+        <w:tc>
+          <w:tcPr>
+            <w:tcW w:type="dxa" w:w="3672"/>
+            <w:vAlign w:val="center"/>
+          </w:tcPr>
+          <w:p>
+            <w:pPr>
+              <w:spacing w:after="0"/>
+            </w:pPr>
+            <w:r/>
+            <w:r>
+              <w:rPr>
+                <w:rFonts w:ascii="Calibri" w:hAnsi="Calibri"/>
+                <w:b w:val="0"/>
+                <w:sz w:val="18"/>
+              </w:rPr>
+              <w:t>Prototype only; not clinical deployment.</w:t>
+            </w:r>
+          </w:p>
+        </w:tc>
+      </w:tr>
+      <w:tr>
+        <w:tc>
+          <w:tcPr>
+            <w:tcW w:type="dxa" w:w="2088"/>
+            <w:vAlign w:val="center"/>
+          </w:tcPr>
+          <w:p>
+            <w:pPr>
+              <w:spacing w:after="0"/>
+            </w:pPr>
+            <w:r/>
+            <w:r>
+              <w:rPr>
+                <w:rFonts w:ascii="Calibri" w:hAnsi="Calibri"/>
+                <w:b w:val="0"/>
+                <w:sz w:val="18"/>
+              </w:rPr>
+              <w:t>Database</w:t>
+            </w:r>
+          </w:p>
+        </w:tc>
+        <w:tc>
+          <w:tcPr>
+            <w:tcW w:type="dxa" w:w="3312"/>
+            <w:vAlign w:val="center"/>
+          </w:tcPr>
+          <w:p>
+            <w:pPr>
+              <w:spacing w:after="0"/>
+            </w:pPr>
+            <w:r/>
+            <w:r>
+              <w:rPr>
+                <w:rFonts w:ascii="Calibri" w:hAnsi="Calibri"/>
+                <w:b w:val="0"/>
+                <w:sz w:val="18"/>
+              </w:rPr>
+              <w:t>CSV/Excel initially; PostgreSQL/MySQL if a formal app is needed.</w:t>
+            </w:r>
+          </w:p>
+        </w:tc>
+        <w:tc>
+          <w:tcPr>
+            <w:tcW w:type="dxa" w:w="3672"/>
+            <w:vAlign w:val="center"/>
+          </w:tcPr>
+          <w:p>
+            <w:pPr>
+              <w:spacing w:after="0"/>
+            </w:pPr>
+            <w:r/>
+            <w:r>
+              <w:rPr>
+                <w:rFonts w:ascii="Calibri" w:hAnsi="Calibri"/>
+                <w:b w:val="0"/>
+                <w:sz w:val="18"/>
+              </w:rPr>
+              <w:t>Depends on data source and system scope.</w:t>
+            </w:r>
+          </w:p>
+        </w:tc>
+      </w:tr>
+    </w:tbl>
+    <w:p/>
+    <w:p>
+      <w:pPr>
+        <w:pStyle w:val="Heading1"/>
+      </w:pPr>
+      <w:r>
+        <w:t>Expected Decision-Support Output</w:t>
+      </w:r>
+    </w:p>
+    <w:tbl>
+      <w:tblPr>
+        <w:tblStyle w:val="TableGrid"/>
+        <w:tblW w:type="auto" w:w="0"/>
+        <w:jc w:val="center"/>
+        <w:tblLook w:firstColumn="1" w:firstRow="1" w:lastColumn="0" w:lastRow="0" w:noHBand="0" w:noVBand="1" w:val="04A0"/>
+      </w:tblPr>
+      <w:tblGrid>
+        <w:gridCol w:w="3120"/>
+        <w:gridCol w:w="3120"/>
+        <w:gridCol w:w="3120"/>
+      </w:tblGrid>
+      <w:tr>
+        <w:tc>
+          <w:tcPr>
+            <w:tcW w:type="dxa" w:w="2304"/>
+            <w:shd w:fill="F2F4F7"/>
+            <w:vAlign w:val="center"/>
+          </w:tcPr>
+          <w:p>
+            <w:pPr>
+              <w:spacing w:after="0"/>
+            </w:pPr>
+            <w:r/>
+            <w:r>
+              <w:rPr>
+                <w:rFonts w:ascii="Calibri" w:hAnsi="Calibri"/>
+                <w:b/>
+                <w:sz w:val="18"/>
+              </w:rPr>
+              <w:t>Output</w:t>
+            </w:r>
+          </w:p>
+        </w:tc>
+        <w:tc>
+          <w:tcPr>
+            <w:tcW w:type="dxa" w:w="3816"/>
+            <w:shd w:fill="F2F4F7"/>
+            <w:vAlign w:val="center"/>
+          </w:tcPr>
+          <w:p>
+            <w:pPr>
+              <w:spacing w:after="0"/>
+            </w:pPr>
+            <w:r/>
+            <w:r>
+              <w:rPr>
+                <w:rFonts w:ascii="Calibri" w:hAnsi="Calibri"/>
+                <w:b/>
+                <w:sz w:val="18"/>
+              </w:rPr>
+              <w:t>Example</w:t>
+            </w:r>
+          </w:p>
+        </w:tc>
+        <w:tc>
+          <w:tcPr>
+            <w:tcW w:type="dxa" w:w="2952"/>
+            <w:shd w:fill="F2F4F7"/>
+            <w:vAlign w:val="center"/>
+          </w:tcPr>
+          <w:p>
+            <w:pPr>
+              <w:spacing w:after="0"/>
+            </w:pPr>
+            <w:r/>
+            <w:r>
+              <w:rPr>
+                <w:rFonts w:ascii="Calibri" w:hAnsi="Calibri"/>
+                <w:b/>
+                <w:sz w:val="18"/>
+              </w:rPr>
+              <w:t>Purpose</w:t>
+            </w:r>
+          </w:p>
+        </w:tc>
+      </w:tr>
+      <w:tr>
+        <w:tc>
+          <w:tcPr>
+            <w:tcW w:type="dxa" w:w="2304"/>
+            <w:vAlign w:val="center"/>
+          </w:tcPr>
+          <w:p>
+            <w:pPr>
+              <w:spacing w:after="0"/>
+            </w:pPr>
+            <w:r/>
+            <w:r>
+              <w:rPr>
+                <w:rFonts w:ascii="Calibri" w:hAnsi="Calibri"/>
+                <w:b w:val="0"/>
+                <w:sz w:val="18"/>
+              </w:rPr>
+              <w:t>Predicted probability</w:t>
+            </w:r>
+          </w:p>
+        </w:tc>
+        <w:tc>
+          <w:tcPr>
+            <w:tcW w:type="dxa" w:w="3816"/>
+            <w:vAlign w:val="center"/>
+          </w:tcPr>
+          <w:p>
+            <w:pPr>
+              <w:spacing w:after="0"/>
+            </w:pPr>
+            <w:r/>
+            <w:r>
+              <w:rPr>
+                <w:rFonts w:ascii="Calibri" w:hAnsi="Calibri"/>
+                <w:b w:val="0"/>
+                <w:sz w:val="18"/>
+              </w:rPr>
+              <w:t>Estimated probability of clinical pregnancy or live birth.</w:t>
+            </w:r>
+          </w:p>
+        </w:tc>
+        <w:tc>
+          <w:tcPr>
+            <w:tcW w:type="dxa" w:w="2952"/>
+            <w:vAlign w:val="center"/>
+          </w:tcPr>
+          <w:p>
+            <w:pPr>
+              <w:spacing w:after="0"/>
+            </w:pPr>
+            <w:r/>
+            <w:r>
+              <w:rPr>
+                <w:rFonts w:ascii="Calibri" w:hAnsi="Calibri"/>
+                <w:b w:val="0"/>
+                <w:sz w:val="18"/>
+              </w:rPr>
+              <w:t>Gives model output in understandable form.</w:t>
+            </w:r>
+          </w:p>
+        </w:tc>
+      </w:tr>
+      <w:tr>
+        <w:tc>
+          <w:tcPr>
+            <w:tcW w:type="dxa" w:w="2304"/>
+            <w:vAlign w:val="center"/>
+          </w:tcPr>
+          <w:p>
+            <w:pPr>
+              <w:spacing w:after="0"/>
+            </w:pPr>
+            <w:r/>
+            <w:r>
+              <w:rPr>
+                <w:rFonts w:ascii="Calibri" w:hAnsi="Calibri"/>
+                <w:b w:val="0"/>
+                <w:sz w:val="18"/>
+              </w:rPr>
+              <w:t>Positive factors</w:t>
+            </w:r>
+          </w:p>
+        </w:tc>
+        <w:tc>
+          <w:tcPr>
+            <w:tcW w:type="dxa" w:w="3816"/>
+            <w:vAlign w:val="center"/>
+          </w:tcPr>
+          <w:p>
+            <w:pPr>
+              <w:spacing w:after="0"/>
+            </w:pPr>
+            <w:r/>
+            <w:r>
+              <w:rPr>
+                <w:rFonts w:ascii="Calibri" w:hAnsi="Calibri"/>
+                <w:b w:val="0"/>
+                <w:sz w:val="18"/>
+              </w:rPr>
+              <w:t>Age range, AMH, embryo grade or endometrial thickness if supportive.</w:t>
+            </w:r>
+          </w:p>
+        </w:tc>
+        <w:tc>
+          <w:tcPr>
+            <w:tcW w:type="dxa" w:w="2952"/>
+            <w:vAlign w:val="center"/>
+          </w:tcPr>
+          <w:p>
+            <w:pPr>
+              <w:spacing w:after="0"/>
+            </w:pPr>
+            <w:r/>
+            <w:r>
+              <w:rPr>
+                <w:rFonts w:ascii="Calibri" w:hAnsi="Calibri"/>
+                <w:b w:val="0"/>
+                <w:sz w:val="18"/>
+              </w:rPr>
+              <w:t>Shows factors increasing predicted chance.</w:t>
+            </w:r>
+          </w:p>
+        </w:tc>
+      </w:tr>
+      <w:tr>
+        <w:tc>
+          <w:tcPr>
+            <w:tcW w:type="dxa" w:w="2304"/>
+            <w:vAlign w:val="center"/>
+          </w:tcPr>
+          <w:p>
+            <w:pPr>
+              <w:spacing w:after="0"/>
+            </w:pPr>
+            <w:r/>
+            <w:r>
+              <w:rPr>
+                <w:rFonts w:ascii="Calibri" w:hAnsi="Calibri"/>
+                <w:b w:val="0"/>
+                <w:sz w:val="18"/>
+              </w:rPr>
+              <w:t>Negative factors</w:t>
+            </w:r>
+          </w:p>
+        </w:tc>
+        <w:tc>
+          <w:tcPr>
+            <w:tcW w:type="dxa" w:w="3816"/>
+            <w:vAlign w:val="center"/>
+          </w:tcPr>
+          <w:p>
+            <w:pPr>
+              <w:spacing w:after="0"/>
+            </w:pPr>
+            <w:r/>
+            <w:r>
+              <w:rPr>
+                <w:rFonts w:ascii="Calibri" w:hAnsi="Calibri"/>
+                <w:b w:val="0"/>
+                <w:sz w:val="18"/>
+              </w:rPr>
+              <w:t>High BMI, low AMH, thin endometrium etc. if model-supported.</w:t>
+            </w:r>
+          </w:p>
+        </w:tc>
+        <w:tc>
+          <w:tcPr>
+            <w:tcW w:type="dxa" w:w="2952"/>
+            <w:vAlign w:val="center"/>
+          </w:tcPr>
+          <w:p>
+            <w:pPr>
+              <w:spacing w:after="0"/>
+            </w:pPr>
+            <w:r/>
+            <w:r>
+              <w:rPr>
+                <w:rFonts w:ascii="Calibri" w:hAnsi="Calibri"/>
+                <w:b w:val="0"/>
+                <w:sz w:val="18"/>
+              </w:rPr>
+              <w:t>Shows factors reducing predicted chance.</w:t>
+            </w:r>
+          </w:p>
+        </w:tc>
+      </w:tr>
+      <w:tr>
+        <w:tc>
+          <w:tcPr>
+            <w:tcW w:type="dxa" w:w="2304"/>
+            <w:vAlign w:val="center"/>
+          </w:tcPr>
+          <w:p>
+            <w:pPr>
+              <w:spacing w:after="0"/>
+            </w:pPr>
+            <w:r/>
+            <w:r>
+              <w:rPr>
+                <w:rFonts w:ascii="Calibri" w:hAnsi="Calibri"/>
+                <w:b w:val="0"/>
+                <w:sz w:val="18"/>
+              </w:rPr>
+              <w:t>Modifiable / non-modifiable split</w:t>
+            </w:r>
+          </w:p>
+        </w:tc>
+        <w:tc>
+          <w:tcPr>
+            <w:tcW w:type="dxa" w:w="3816"/>
+            <w:vAlign w:val="center"/>
+          </w:tcPr>
+          <w:p>
+            <w:pPr>
+              <w:spacing w:after="0"/>
+            </w:pPr>
+            <w:r/>
+            <w:r>
+              <w:rPr>
+                <w:rFonts w:ascii="Calibri" w:hAnsi="Calibri"/>
+                <w:b w:val="0"/>
+                <w:sz w:val="18"/>
+              </w:rPr>
+              <w:t>BMI or smoking versus age or infertility duration.</w:t>
+            </w:r>
+          </w:p>
+        </w:tc>
+        <w:tc>
+          <w:tcPr>
+            <w:tcW w:type="dxa" w:w="2952"/>
+            <w:vAlign w:val="center"/>
+          </w:tcPr>
+          <w:p>
+            <w:pPr>
+              <w:spacing w:after="0"/>
+            </w:pPr>
+            <w:r/>
+            <w:r>
+              <w:rPr>
+                <w:rFonts w:ascii="Calibri" w:hAnsi="Calibri"/>
+                <w:b w:val="0"/>
+                <w:sz w:val="18"/>
+              </w:rPr>
+              <w:t>Helps counselling without overclaiming.</w:t>
+            </w:r>
+          </w:p>
+        </w:tc>
+      </w:tr>
+      <w:tr>
+        <w:tc>
+          <w:tcPr>
+            <w:tcW w:type="dxa" w:w="2304"/>
+            <w:vAlign w:val="center"/>
+          </w:tcPr>
+          <w:p>
+            <w:pPr>
+              <w:spacing w:after="0"/>
+            </w:pPr>
+            <w:r/>
+            <w:r>
+              <w:rPr>
+                <w:rFonts w:ascii="Calibri" w:hAnsi="Calibri"/>
+                <w:b w:val="0"/>
+                <w:sz w:val="18"/>
+              </w:rPr>
+              <w:t>Caution note</w:t>
+            </w:r>
+          </w:p>
+        </w:tc>
+        <w:tc>
+          <w:tcPr>
+            <w:tcW w:type="dxa" w:w="3816"/>
+            <w:vAlign w:val="center"/>
+          </w:tcPr>
+          <w:p>
+            <w:pPr>
+              <w:spacing w:after="0"/>
+            </w:pPr>
+            <w:r/>
+            <w:r>
+              <w:rPr>
+                <w:rFonts w:ascii="Calibri" w:hAnsi="Calibri"/>
+                <w:b w:val="0"/>
+                <w:sz w:val="18"/>
+              </w:rPr>
+              <w:t>Decision support only; clinician judgment remains final.</w:t>
+            </w:r>
+          </w:p>
+        </w:tc>
+        <w:tc>
+          <w:tcPr>
+            <w:tcW w:type="dxa" w:w="2952"/>
+            <w:vAlign w:val="center"/>
+          </w:tcPr>
+          <w:p>
+            <w:pPr>
+              <w:spacing w:after="0"/>
+            </w:pPr>
+            <w:r/>
+            <w:r>
+              <w:rPr>
+                <w:rFonts w:ascii="Calibri" w:hAnsi="Calibri"/>
+                <w:b w:val="0"/>
+                <w:sz w:val="18"/>
+              </w:rPr>
+              <w:t>Prevents inappropriate use.</w:t>
+            </w:r>
+          </w:p>
+        </w:tc>
+      </w:tr>
+    </w:tbl>
+    <w:p/>
+    <w:p>
+      <w:pPr>
+        <w:pStyle w:val="Heading1"/>
+      </w:pPr>
+      <w:r>
+        <w:t>Dataset-Dependent Technical Choices</w:t>
+      </w:r>
+    </w:p>
+    <w:tbl>
+      <w:tblPr>
+        <w:tblStyle w:val="TableGrid"/>
+        <w:tblW w:type="auto" w:w="0"/>
+        <w:jc w:val="center"/>
+        <w:tblLook w:firstColumn="1" w:firstRow="1" w:lastColumn="0" w:lastRow="0" w:noHBand="0" w:noVBand="1" w:val="04A0"/>
+      </w:tblPr>
+      <w:tblGrid>
+        <w:gridCol w:w="4680"/>
+        <w:gridCol w:w="4680"/>
+      </w:tblGrid>
+      <w:tr>
+        <w:tc>
+          <w:tcPr>
+            <w:tcW w:type="dxa" w:w="2880"/>
+            <w:shd w:fill="F2F4F7"/>
+            <w:vAlign w:val="center"/>
+          </w:tcPr>
+          <w:p>
+            <w:pPr>
+              <w:spacing w:after="0"/>
+            </w:pPr>
+            <w:r/>
+            <w:r>
+              <w:rPr>
+                <w:rFonts w:ascii="Calibri" w:hAnsi="Calibri"/>
+                <w:b/>
+                <w:sz w:val="18"/>
+              </w:rPr>
+              <w:t>Dataset Situation</w:t>
+            </w:r>
+          </w:p>
+        </w:tc>
+        <w:tc>
+          <w:tcPr>
+            <w:tcW w:type="dxa" w:w="6192"/>
+            <w:shd w:fill="F2F4F7"/>
+            <w:vAlign w:val="center"/>
+          </w:tcPr>
+          <w:p>
+            <w:pPr>
+              <w:spacing w:after="0"/>
+            </w:pPr>
+            <w:r/>
+            <w:r>
+              <w:rPr>
+                <w:rFonts w:ascii="Calibri" w:hAnsi="Calibri"/>
+                <w:b/>
+                <w:sz w:val="18"/>
+              </w:rPr>
+              <w:t>Technical Direction</w:t>
+            </w:r>
+          </w:p>
+        </w:tc>
+      </w:tr>
+      <w:tr>
+        <w:tc>
+          <w:tcPr>
+            <w:tcW w:type="dxa" w:w="2880"/>
+            <w:vAlign w:val="center"/>
+          </w:tcPr>
+          <w:p>
+            <w:pPr>
+              <w:spacing w:after="0"/>
+            </w:pPr>
+            <w:r/>
+            <w:r>
+              <w:rPr>
+                <w:rFonts w:ascii="Calibri" w:hAnsi="Calibri"/>
+                <w:b w:val="0"/>
+                <w:sz w:val="18"/>
+              </w:rPr>
+              <w:t>Clinical data only</w:t>
+            </w:r>
+          </w:p>
+        </w:tc>
+        <w:tc>
+          <w:tcPr>
+            <w:tcW w:type="dxa" w:w="6192"/>
+            <w:vAlign w:val="center"/>
+          </w:tcPr>
+          <w:p>
+            <w:pPr>
+              <w:spacing w:after="0"/>
+            </w:pPr>
+            <w:r/>
+            <w:r>
+              <w:rPr>
+                <w:rFonts w:ascii="Calibri" w:hAnsi="Calibri"/>
+                <w:b w:val="0"/>
+                <w:sz w:val="18"/>
+              </w:rPr>
+              <w:t>Tabular ML with XAI and internal/temporal validation.</w:t>
+            </w:r>
+          </w:p>
+        </w:tc>
+      </w:tr>
+      <w:tr>
+        <w:tc>
+          <w:tcPr>
+            <w:tcW w:type="dxa" w:w="2880"/>
+            <w:vAlign w:val="center"/>
+          </w:tcPr>
+          <w:p>
+            <w:pPr>
+              <w:spacing w:after="0"/>
+            </w:pPr>
+            <w:r/>
+            <w:r>
+              <w:rPr>
+                <w:rFonts w:ascii="Calibri" w:hAnsi="Calibri"/>
+                <w:b w:val="0"/>
+                <w:sz w:val="18"/>
+              </w:rPr>
+              <w:t>Clinical + embryology</w:t>
+            </w:r>
+          </w:p>
+        </w:tc>
+        <w:tc>
+          <w:tcPr>
+            <w:tcW w:type="dxa" w:w="6192"/>
+            <w:vAlign w:val="center"/>
+          </w:tcPr>
+          <w:p>
+            <w:pPr>
+              <w:spacing w:after="0"/>
+            </w:pPr>
+            <w:r/>
+            <w:r>
+              <w:rPr>
+                <w:rFonts w:ascii="Calibri" w:hAnsi="Calibri"/>
+                <w:b w:val="0"/>
+                <w:sz w:val="18"/>
+              </w:rPr>
+              <w:t>Multimodal tabular modelling with clinical and embryology feature groups.</w:t>
+            </w:r>
+          </w:p>
+        </w:tc>
+      </w:tr>
+      <w:tr>
+        <w:tc>
+          <w:tcPr>
+            <w:tcW w:type="dxa" w:w="2880"/>
+            <w:vAlign w:val="center"/>
+          </w:tcPr>
+          <w:p>
+            <w:pPr>
+              <w:spacing w:after="0"/>
+            </w:pPr>
+            <w:r/>
+            <w:r>
+              <w:rPr>
+                <w:rFonts w:ascii="Calibri" w:hAnsi="Calibri"/>
+                <w:b w:val="0"/>
+                <w:sz w:val="18"/>
+              </w:rPr>
+              <w:t>Image/time-lapse data</w:t>
+            </w:r>
+          </w:p>
+        </w:tc>
+        <w:tc>
+          <w:tcPr>
+            <w:tcW w:type="dxa" w:w="6192"/>
+            <w:vAlign w:val="center"/>
+          </w:tcPr>
+          <w:p>
+            <w:pPr>
+              <w:spacing w:after="0"/>
+            </w:pPr>
+            <w:r/>
+            <w:r>
+              <w:rPr>
+                <w:rFonts w:ascii="Calibri" w:hAnsi="Calibri"/>
+                <w:b w:val="0"/>
+                <w:sz w:val="18"/>
+              </w:rPr>
+              <w:t>Deep learning or hybrid model only if data volume, labels and ethics support it.</w:t>
+            </w:r>
+          </w:p>
+        </w:tc>
+      </w:tr>
+      <w:tr>
+        <w:tc>
+          <w:tcPr>
+            <w:tcW w:type="dxa" w:w="2880"/>
+            <w:vAlign w:val="center"/>
+          </w:tcPr>
+          <w:p>
+            <w:pPr>
+              <w:spacing w:after="0"/>
+            </w:pPr>
+            <w:r/>
+            <w:r>
+              <w:rPr>
+                <w:rFonts w:ascii="Calibri" w:hAnsi="Calibri"/>
+                <w:b w:val="0"/>
+                <w:sz w:val="18"/>
+              </w:rPr>
+              <w:t>Lifestyle data</w:t>
+            </w:r>
+          </w:p>
+        </w:tc>
+        <w:tc>
+          <w:tcPr>
+            <w:tcW w:type="dxa" w:w="6192"/>
+            <w:vAlign w:val="center"/>
+          </w:tcPr>
+          <w:p>
+            <w:pPr>
+              <w:spacing w:after="0"/>
+            </w:pPr>
+            <w:r/>
+            <w:r>
+              <w:rPr>
+                <w:rFonts w:ascii="Calibri" w:hAnsi="Calibri"/>
+                <w:b w:val="0"/>
+                <w:sz w:val="18"/>
+              </w:rPr>
+              <w:t>Add questionnaire/context variables; analyze carefully and avoid causal claims.</w:t>
+            </w:r>
+          </w:p>
+        </w:tc>
+      </w:tr>
+      <w:tr>
+        <w:tc>
+          <w:tcPr>
+            <w:tcW w:type="dxa" w:w="2880"/>
+            <w:vAlign w:val="center"/>
+          </w:tcPr>
+          <w:p>
+            <w:pPr>
+              <w:spacing w:after="0"/>
+            </w:pPr>
+            <w:r/>
+            <w:r>
+              <w:rPr>
+                <w:rFonts w:ascii="Calibri" w:hAnsi="Calibri"/>
+                <w:b w:val="0"/>
+                <w:sz w:val="18"/>
+              </w:rPr>
+              <w:t>Multiple clinics/sources</w:t>
+            </w:r>
+          </w:p>
+        </w:tc>
+        <w:tc>
+          <w:tcPr>
+            <w:tcW w:type="dxa" w:w="6192"/>
+            <w:vAlign w:val="center"/>
+          </w:tcPr>
+          <w:p>
+            <w:pPr>
+              <w:spacing w:after="0"/>
+            </w:pPr>
+            <w:r/>
+            <w:r>
+              <w:rPr>
+                <w:rFonts w:ascii="Calibri" w:hAnsi="Calibri"/>
+                <w:b w:val="0"/>
+                <w:sz w:val="18"/>
+              </w:rPr>
+              <w:t>External validation and clinic-wise generalization analysis.</w:t>
+            </w:r>
+          </w:p>
+        </w:tc>
+      </w:tr>
+      <w:tr>
+        <w:tc>
+          <w:tcPr>
+            <w:tcW w:type="dxa" w:w="2880"/>
+            <w:vAlign w:val="center"/>
+          </w:tcPr>
+          <w:p>
+            <w:pPr>
+              <w:spacing w:after="0"/>
+            </w:pPr>
+            <w:r/>
+            <w:r>
+              <w:rPr>
+                <w:rFonts w:ascii="Calibri" w:hAnsi="Calibri"/>
+                <w:b w:val="0"/>
+                <w:sz w:val="18"/>
+              </w:rPr>
+              <w:t>Clinician review possible</w:t>
+            </w:r>
+          </w:p>
+        </w:tc>
+        <w:tc>
+          <w:tcPr>
+            <w:tcW w:type="dxa" w:w="6192"/>
+            <w:vAlign w:val="center"/>
+          </w:tcPr>
+          <w:p>
+            <w:pPr>
+              <w:spacing w:after="0"/>
+            </w:pPr>
+            <w:r/>
+            <w:r>
+              <w:rPr>
+                <w:rFonts w:ascii="Calibri" w:hAnsi="Calibri"/>
+                <w:b w:val="0"/>
+                <w:sz w:val="18"/>
+              </w:rPr>
+              <w:t>Add structured usability or usefulness evaluation of explanation outputs.</w:t>
+            </w:r>
+          </w:p>
+        </w:tc>
+      </w:tr>
+    </w:tbl>
+    <w:p/>
+    <w:p>
+      <w:pPr>
+        <w:pStyle w:val="Heading1"/>
+      </w:pPr>
+      <w:r>
+        <w:t>Implementation Roadmap</w:t>
+      </w:r>
+    </w:p>
+    <w:tbl>
+      <w:tblPr>
+        <w:tblStyle w:val="TableGrid"/>
+        <w:tblW w:type="auto" w:w="0"/>
+        <w:jc w:val="center"/>
+        <w:tblLook w:firstColumn="1" w:firstRow="1" w:lastColumn="0" w:lastRow="0" w:noHBand="0" w:noVBand="1" w:val="04A0"/>
+      </w:tblPr>
+      <w:tblGrid>
+        <w:gridCol w:w="4680"/>
+        <w:gridCol w:w="4680"/>
+      </w:tblGrid>
+      <w:tr>
+        <w:tc>
+          <w:tcPr>
+            <w:tcW w:type="dxa" w:w="3240"/>
+            <w:shd w:fill="F2F4F7"/>
+            <w:vAlign w:val="center"/>
+          </w:tcPr>
+          <w:p>
+            <w:pPr>
+              <w:spacing w:after="0"/>
+            </w:pPr>
+            <w:r/>
+            <w:r>
+              <w:rPr>
+                <w:rFonts w:ascii="Calibri" w:hAnsi="Calibri"/>
+                <w:b/>
+                <w:sz w:val="18"/>
+              </w:rPr>
+              <w:t>Work Package</w:t>
+            </w:r>
+          </w:p>
+        </w:tc>
+        <w:tc>
+          <w:tcPr>
+            <w:tcW w:type="dxa" w:w="5832"/>
+            <w:shd w:fill="F2F4F7"/>
+            <w:vAlign w:val="center"/>
+          </w:tcPr>
+          <w:p>
+            <w:pPr>
+              <w:spacing w:after="0"/>
+            </w:pPr>
+            <w:r/>
+            <w:r>
+              <w:rPr>
+                <w:rFonts w:ascii="Calibri" w:hAnsi="Calibri"/>
+                <w:b/>
+                <w:sz w:val="18"/>
+              </w:rPr>
+              <w:t>Output</w:t>
+            </w:r>
+          </w:p>
+        </w:tc>
+      </w:tr>
+      <w:tr>
+        <w:tc>
+          <w:tcPr>
+            <w:tcW w:type="dxa" w:w="3240"/>
+            <w:vAlign w:val="center"/>
+          </w:tcPr>
+          <w:p>
+            <w:pPr>
+              <w:spacing w:after="0"/>
+            </w:pPr>
+            <w:r/>
+            <w:r>
+              <w:rPr>
+                <w:rFonts w:ascii="Calibri" w:hAnsi="Calibri"/>
+                <w:b w:val="0"/>
+                <w:sz w:val="18"/>
+              </w:rPr>
+              <w:t>Data access and ethics</w:t>
+            </w:r>
+          </w:p>
+        </w:tc>
+        <w:tc>
+          <w:tcPr>
+            <w:tcW w:type="dxa" w:w="5832"/>
+            <w:vAlign w:val="center"/>
+          </w:tcPr>
+          <w:p>
+            <w:pPr>
+              <w:spacing w:after="0"/>
+            </w:pPr>
+            <w:r/>
+            <w:r>
+              <w:rPr>
+                <w:rFonts w:ascii="Calibri" w:hAnsi="Calibri"/>
+                <w:b w:val="0"/>
+                <w:sz w:val="18"/>
+              </w:rPr>
+              <w:t>Permission, variable list and anonymization plan.</w:t>
+            </w:r>
+          </w:p>
+        </w:tc>
+      </w:tr>
+      <w:tr>
+        <w:tc>
+          <w:tcPr>
+            <w:tcW w:type="dxa" w:w="3240"/>
+            <w:vAlign w:val="center"/>
+          </w:tcPr>
+          <w:p>
+            <w:pPr>
+              <w:spacing w:after="0"/>
+            </w:pPr>
+            <w:r/>
+            <w:r>
+              <w:rPr>
+                <w:rFonts w:ascii="Calibri" w:hAnsi="Calibri"/>
+                <w:b w:val="0"/>
+                <w:sz w:val="18"/>
+              </w:rPr>
+              <w:t>Data preparation</w:t>
+            </w:r>
+          </w:p>
+        </w:tc>
+        <w:tc>
+          <w:tcPr>
+            <w:tcW w:type="dxa" w:w="5832"/>
+            <w:vAlign w:val="center"/>
+          </w:tcPr>
+          <w:p>
+            <w:pPr>
+              <w:spacing w:after="0"/>
+            </w:pPr>
+            <w:r/>
+            <w:r>
+              <w:rPr>
+                <w:rFonts w:ascii="Calibri" w:hAnsi="Calibri"/>
+                <w:b w:val="0"/>
+                <w:sz w:val="18"/>
+              </w:rPr>
+              <w:t>Cleaned dataset and feature dictionary.</w:t>
+            </w:r>
+          </w:p>
+        </w:tc>
+      </w:tr>
+      <w:tr>
+        <w:tc>
+          <w:tcPr>
+            <w:tcW w:type="dxa" w:w="3240"/>
+            <w:vAlign w:val="center"/>
+          </w:tcPr>
+          <w:p>
+            <w:pPr>
+              <w:spacing w:after="0"/>
+            </w:pPr>
+            <w:r/>
+            <w:r>
+              <w:rPr>
+                <w:rFonts w:ascii="Calibri" w:hAnsi="Calibri"/>
+                <w:b w:val="0"/>
+                <w:sz w:val="18"/>
+              </w:rPr>
+              <w:t>EDA</w:t>
+            </w:r>
+          </w:p>
+        </w:tc>
+        <w:tc>
+          <w:tcPr>
+            <w:tcW w:type="dxa" w:w="5832"/>
+            <w:vAlign w:val="center"/>
+          </w:tcPr>
+          <w:p>
+            <w:pPr>
+              <w:spacing w:after="0"/>
+            </w:pPr>
+            <w:r/>
+            <w:r>
+              <w:rPr>
+                <w:rFonts w:ascii="Calibri" w:hAnsi="Calibri"/>
+                <w:b w:val="0"/>
+                <w:sz w:val="18"/>
+              </w:rPr>
+              <w:t>Missingness, distributions, outcome rates and imbalance summary.</w:t>
+            </w:r>
+          </w:p>
+        </w:tc>
+      </w:tr>
+      <w:tr>
+        <w:tc>
+          <w:tcPr>
+            <w:tcW w:type="dxa" w:w="3240"/>
+            <w:vAlign w:val="center"/>
+          </w:tcPr>
+          <w:p>
+            <w:pPr>
+              <w:spacing w:after="0"/>
+            </w:pPr>
+            <w:r/>
+            <w:r>
+              <w:rPr>
+                <w:rFonts w:ascii="Calibri" w:hAnsi="Calibri"/>
+                <w:b w:val="0"/>
+                <w:sz w:val="18"/>
+              </w:rPr>
+              <w:t>Model development</w:t>
+            </w:r>
+          </w:p>
+        </w:tc>
+        <w:tc>
+          <w:tcPr>
+            <w:tcW w:type="dxa" w:w="5832"/>
+            <w:vAlign w:val="center"/>
+          </w:tcPr>
+          <w:p>
+            <w:pPr>
+              <w:spacing w:after="0"/>
+            </w:pPr>
+            <w:r/>
+            <w:r>
+              <w:rPr>
+                <w:rFonts w:ascii="Calibri" w:hAnsi="Calibri"/>
+                <w:b w:val="0"/>
+                <w:sz w:val="18"/>
+              </w:rPr>
+              <w:t>Baseline and advanced model comparison.</w:t>
+            </w:r>
+          </w:p>
+        </w:tc>
+      </w:tr>
+      <w:tr>
+        <w:tc>
+          <w:tcPr>
+            <w:tcW w:type="dxa" w:w="3240"/>
+            <w:vAlign w:val="center"/>
+          </w:tcPr>
+          <w:p>
+            <w:pPr>
+              <w:spacing w:after="0"/>
+            </w:pPr>
+            <w:r/>
+            <w:r>
+              <w:rPr>
+                <w:rFonts w:ascii="Calibri" w:hAnsi="Calibri"/>
+                <w:b w:val="0"/>
+                <w:sz w:val="18"/>
+              </w:rPr>
+              <w:t>XAI integration</w:t>
+            </w:r>
+          </w:p>
+        </w:tc>
+        <w:tc>
+          <w:tcPr>
+            <w:tcW w:type="dxa" w:w="5832"/>
+            <w:vAlign w:val="center"/>
+          </w:tcPr>
+          <w:p>
+            <w:pPr>
+              <w:spacing w:after="0"/>
+            </w:pPr>
+            <w:r/>
+            <w:r>
+              <w:rPr>
+                <w:rFonts w:ascii="Calibri" w:hAnsi="Calibri"/>
+                <w:b w:val="0"/>
+                <w:sz w:val="18"/>
+              </w:rPr>
+              <w:t>Global and patient-level explanation outputs.</w:t>
+            </w:r>
+          </w:p>
+        </w:tc>
+      </w:tr>
+      <w:tr>
+        <w:tc>
+          <w:tcPr>
+            <w:tcW w:type="dxa" w:w="3240"/>
+            <w:vAlign w:val="center"/>
+          </w:tcPr>
+          <w:p>
+            <w:pPr>
+              <w:spacing w:after="0"/>
+            </w:pPr>
+            <w:r/>
+            <w:r>
+              <w:rPr>
+                <w:rFonts w:ascii="Calibri" w:hAnsi="Calibri"/>
+                <w:b w:val="0"/>
+                <w:sz w:val="18"/>
+              </w:rPr>
+              <w:t>Validation</w:t>
+            </w:r>
+          </w:p>
+        </w:tc>
+        <w:tc>
+          <w:tcPr>
+            <w:tcW w:type="dxa" w:w="5832"/>
+            <w:vAlign w:val="center"/>
+          </w:tcPr>
+          <w:p>
+            <w:pPr>
+              <w:spacing w:after="0"/>
+            </w:pPr>
+            <w:r/>
+            <w:r>
+              <w:rPr>
+                <w:rFonts w:ascii="Calibri" w:hAnsi="Calibri"/>
+                <w:b w:val="0"/>
+                <w:sz w:val="18"/>
+              </w:rPr>
+              <w:t>Internal/temporal/subgroup/external validation report as feasible.</w:t>
+            </w:r>
+          </w:p>
+        </w:tc>
+      </w:tr>
+      <w:tr>
+        <w:tc>
+          <w:tcPr>
+            <w:tcW w:type="dxa" w:w="3240"/>
+            <w:vAlign w:val="center"/>
+          </w:tcPr>
+          <w:p>
+            <w:pPr>
+              <w:spacing w:after="0"/>
+            </w:pPr>
+            <w:r/>
+            <w:r>
+              <w:rPr>
+                <w:rFonts w:ascii="Calibri" w:hAnsi="Calibri"/>
+                <w:b w:val="0"/>
+                <w:sz w:val="18"/>
+              </w:rPr>
+              <w:t>Prototype</w:t>
+            </w:r>
+          </w:p>
+        </w:tc>
+        <w:tc>
+          <w:tcPr>
+            <w:tcW w:type="dxa" w:w="5832"/>
+            <w:vAlign w:val="center"/>
+          </w:tcPr>
+          <w:p>
+            <w:pPr>
+              <w:spacing w:after="0"/>
+            </w:pPr>
+            <w:r/>
+            <w:r>
+              <w:rPr>
+                <w:rFonts w:ascii="Calibri" w:hAnsi="Calibri"/>
+                <w:b w:val="0"/>
+                <w:sz w:val="18"/>
+              </w:rPr>
+              <w:t>Doctor-facing decision-support screen or report.</w:t>
+            </w:r>
+          </w:p>
+        </w:tc>
+      </w:tr>
+      <w:tr>
+        <w:tc>
+          <w:tcPr>
+            <w:tcW w:type="dxa" w:w="3240"/>
+            <w:vAlign w:val="center"/>
+          </w:tcPr>
+          <w:p>
+            <w:pPr>
+              <w:spacing w:after="0"/>
+            </w:pPr>
+            <w:r/>
+            <w:r>
+              <w:rPr>
+                <w:rFonts w:ascii="Calibri" w:hAnsi="Calibri"/>
+                <w:b w:val="0"/>
+                <w:sz w:val="18"/>
+              </w:rPr>
+              <w:t>Clinician review</w:t>
+            </w:r>
+          </w:p>
+        </w:tc>
+        <w:tc>
+          <w:tcPr>
+            <w:tcW w:type="dxa" w:w="5832"/>
+            <w:vAlign w:val="center"/>
+          </w:tcPr>
+          <w:p>
+            <w:pPr>
+              <w:spacing w:after="0"/>
+            </w:pPr>
+            <w:r/>
+            <w:r>
+              <w:rPr>
+                <w:rFonts w:ascii="Calibri" w:hAnsi="Calibri"/>
+                <w:b w:val="0"/>
+                <w:sz w:val="18"/>
+              </w:rPr>
+              <w:t>Feedback on explanation clarity and usefulness if feasible.</w:t>
             </w:r>
           </w:p>
         </w:tc>
@@ -737,8 +3984,43 @@
       </w:r>
     </w:p>
     <w:p>
+      <w:pPr>
+        <w:pStyle w:val="ListBullet"/>
+      </w:pPr>
       <w:r>
-        <w:t>The current plan should not claim treatment improvement or clinical deployment. The defensible claim is prediction, explanation, validation and decision-support design.</w:t>
+        <w:t>Do not claim the model improves IVF success unless a clinical outcome study proves it.</w:t>
+      </w:r>
+    </w:p>
+    <w:p>
+      <w:pPr>
+        <w:pStyle w:val="ListBullet"/>
+      </w:pPr>
+      <w:r>
+        <w:t>Do not claim deployment; use prototype or decision-support framework language.</w:t>
+      </w:r>
+    </w:p>
+    <w:p>
+      <w:pPr>
+        <w:pStyle w:val="ListBullet"/>
+      </w:pPr>
+      <w:r>
+        <w:t>Do not claim causality from retrospective prediction data.</w:t>
+      </w:r>
+    </w:p>
+    <w:p>
+      <w:pPr>
+        <w:pStyle w:val="ListBullet"/>
+      </w:pPr>
+      <w:r>
+        <w:t>Do not use deep learning as the main plan unless the dataset justifies it.</w:t>
+      </w:r>
+    </w:p>
+    <w:p>
+      <w:pPr>
+        <w:pStyle w:val="ListBullet"/>
+      </w:pPr>
+      <w:r>
+        <w:t>The defensible contribution is prediction, explanation, validation and clinician-facing decision-support design.</w:t>
       </w:r>
     </w:p>
     <w:sectPr>

</xml_diff>